<commit_message>
Adding python code to load data into PostgreSQL
</commit_message>
<xml_diff>
--- a/sql/SQL Scripts for Renewable Energy Project.docx
+++ b/sql/SQL Scripts for Renewable Energy Project.docx
@@ -83,8 +83,16 @@
         <w:rPr>
           <w:rFonts w:ascii="Calibri" w:hAnsi="Calibri" w:cs="Calibri"/>
         </w:rPr>
-        <w:t xml:space="preserve">    OWNER = postgres</w:t>
-      </w:r>
+        <w:t xml:space="preserve">    OWNER = </w:t>
+      </w:r>
+      <w:proofErr w:type="spellStart"/>
+      <w:r>
+        <w:rPr>
+          <w:rFonts w:ascii="Calibri" w:hAnsi="Calibri" w:cs="Calibri"/>
+        </w:rPr>
+        <w:t>postgres</w:t>
+      </w:r>
+      <w:proofErr w:type="spellEnd"/>
     </w:p>
     <w:p>
       <w:pPr>
@@ -111,7 +119,21 @@
         <w:rPr>
           <w:rFonts w:ascii="Calibri" w:hAnsi="Calibri" w:cs="Calibri"/>
         </w:rPr>
-        <w:t xml:space="preserve">    LOCALE_PROVIDER = 'libc'</w:t>
+        <w:t xml:space="preserve">    LOCALE_PROVIDER = '</w:t>
+      </w:r>
+      <w:proofErr w:type="spellStart"/>
+      <w:r>
+        <w:rPr>
+          <w:rFonts w:ascii="Calibri" w:hAnsi="Calibri" w:cs="Calibri"/>
+        </w:rPr>
+        <w:t>libc</w:t>
+      </w:r>
+      <w:proofErr w:type="spellEnd"/>
+      <w:r>
+        <w:rPr>
+          <w:rFonts w:ascii="Calibri" w:hAnsi="Calibri" w:cs="Calibri"/>
+        </w:rPr>
+        <w:t>'</w:t>
       </w:r>
     </w:p>
     <w:p>
@@ -175,7 +197,7 @@
         <w:rPr>
           <w:rFonts w:ascii="Calibri" w:hAnsi="Calibri" w:cs="Calibri"/>
         </w:rPr>
-        <w:t xml:space="preserve">    IS 'Database for world''s energy generation, production and consumption.';</w:t>
+        <w:t xml:space="preserve">    IS 'Database for world's energy generation, production and consumption.';</w:t>
       </w:r>
     </w:p>
     <w:p>
@@ -214,81 +236,1645 @@
     </w:p>
     <w:p>
       <w:pPr>
-        <w:jc w:val="both"/>
-        <w:rPr>
-          <w:rFonts w:ascii="Calibri" w:hAnsi="Calibri" w:cs="Calibri"/>
-        </w:rPr>
-      </w:pPr>
-      <w:r>
-        <w:rPr>
-          <w:rFonts w:ascii="Calibri" w:hAnsi="Calibri" w:cs="Calibri"/>
-        </w:rPr>
-        <w:t>CREATE TABLE isocodes (</w:t>
-      </w:r>
-    </w:p>
-    <w:p>
-      <w:pPr>
-        <w:jc w:val="both"/>
-        <w:rPr>
-          <w:rFonts w:ascii="Calibri" w:hAnsi="Calibri" w:cs="Calibri"/>
-        </w:rPr>
-      </w:pPr>
-      <w:r>
-        <w:rPr>
-          <w:rFonts w:ascii="Calibri" w:hAnsi="Calibri" w:cs="Calibri"/>
-        </w:rPr>
-        <w:t>CountryName text,</w:t>
-      </w:r>
-    </w:p>
-    <w:p>
-      <w:pPr>
-        <w:jc w:val="both"/>
-        <w:rPr>
-          <w:rFonts w:ascii="Calibri" w:hAnsi="Calibri" w:cs="Calibri"/>
-        </w:rPr>
-      </w:pPr>
-      <w:r>
-        <w:rPr>
-          <w:rFonts w:ascii="Calibri" w:hAnsi="Calibri" w:cs="Calibri"/>
-        </w:rPr>
-        <w:t>ISOCode varchar(3) ,</w:t>
-      </w:r>
-    </w:p>
-    <w:p>
-      <w:pPr>
-        <w:jc w:val="both"/>
-        <w:rPr>
-          <w:rFonts w:ascii="Calibri" w:hAnsi="Calibri" w:cs="Calibri"/>
-        </w:rPr>
-      </w:pPr>
-      <w:r>
-        <w:rPr>
-          <w:rFonts w:ascii="Calibri" w:hAnsi="Calibri" w:cs="Calibri"/>
-        </w:rPr>
-        <w:t>"ISO3166-2" text</w:t>
-      </w:r>
-    </w:p>
-    <w:p>
-      <w:pPr>
-        <w:jc w:val="both"/>
-        <w:rPr>
-          <w:rFonts w:ascii="Calibri" w:hAnsi="Calibri" w:cs="Calibri"/>
-        </w:rPr>
-      </w:pPr>
-      <w:r>
-        <w:rPr>
-          <w:rFonts w:ascii="Calibri" w:hAnsi="Calibri" w:cs="Calibri"/>
-        </w:rPr>
+        <w:pStyle w:val="NoSpacing"/>
+      </w:pPr>
+      <w:r>
+        <w:t xml:space="preserve">-- Table: </w:t>
+      </w:r>
+      <w:proofErr w:type="spellStart"/>
+      <w:r>
+        <w:t>public.isocodes</w:t>
+      </w:r>
+      <w:proofErr w:type="spellEnd"/>
+    </w:p>
+    <w:p>
+      <w:pPr>
+        <w:pStyle w:val="NoSpacing"/>
+      </w:pPr>
+    </w:p>
+    <w:p>
+      <w:pPr>
+        <w:pStyle w:val="NoSpacing"/>
+      </w:pPr>
+      <w:r>
+        <w:t xml:space="preserve">-- DROP TABLE IF EXISTS </w:t>
+      </w:r>
+      <w:proofErr w:type="spellStart"/>
+      <w:r>
+        <w:t>public.isocodes</w:t>
+      </w:r>
+      <w:proofErr w:type="spellEnd"/>
+      <w:r>
+        <w:t>;</w:t>
+      </w:r>
+    </w:p>
+    <w:p>
+      <w:pPr>
+        <w:pStyle w:val="NoSpacing"/>
+      </w:pPr>
+    </w:p>
+    <w:p>
+      <w:pPr>
+        <w:pStyle w:val="NoSpacing"/>
+      </w:pPr>
+      <w:r>
+        <w:t xml:space="preserve">CREATE TABLE IF NOT EXISTS </w:t>
+      </w:r>
+      <w:proofErr w:type="spellStart"/>
+      <w:r>
+        <w:t>public.isocodes</w:t>
+      </w:r>
+      <w:proofErr w:type="spellEnd"/>
+    </w:p>
+    <w:p>
+      <w:pPr>
+        <w:pStyle w:val="NoSpacing"/>
+      </w:pPr>
+      <w:r>
+        <w:t>(</w:t>
+      </w:r>
+    </w:p>
+    <w:p>
+      <w:pPr>
+        <w:pStyle w:val="NoSpacing"/>
+      </w:pPr>
+      <w:r>
+        <w:t xml:space="preserve">    </w:t>
+      </w:r>
+      <w:proofErr w:type="spellStart"/>
+      <w:r>
+        <w:t>countryname</w:t>
+      </w:r>
+      <w:proofErr w:type="spellEnd"/>
+      <w:r>
+        <w:t xml:space="preserve"> text COLLATE </w:t>
+      </w:r>
+      <w:proofErr w:type="spellStart"/>
+      <w:r>
+        <w:t>pg_catalog."default</w:t>
+      </w:r>
+      <w:proofErr w:type="spellEnd"/>
+      <w:r>
+        <w:t>",</w:t>
+      </w:r>
+    </w:p>
+    <w:p>
+      <w:pPr>
+        <w:pStyle w:val="NoSpacing"/>
+      </w:pPr>
+      <w:r>
+        <w:t xml:space="preserve">    </w:t>
+      </w:r>
+      <w:proofErr w:type="spellStart"/>
+      <w:r>
+        <w:t>isocode</w:t>
+      </w:r>
+      <w:proofErr w:type="spellEnd"/>
+      <w:r>
+        <w:t xml:space="preserve"> character varying(3) COLLATE </w:t>
+      </w:r>
+      <w:proofErr w:type="spellStart"/>
+      <w:r>
+        <w:t>pg_catalog."default</w:t>
+      </w:r>
+      <w:proofErr w:type="spellEnd"/>
+      <w:r>
+        <w:t>" NOT NULL,</w:t>
+      </w:r>
+    </w:p>
+    <w:p>
+      <w:pPr>
+        <w:pStyle w:val="NoSpacing"/>
+      </w:pPr>
+      <w:r>
+        <w:t xml:space="preserve">    "ISO3166-2" text COLLATE </w:t>
+      </w:r>
+      <w:proofErr w:type="spellStart"/>
+      <w:r>
+        <w:t>pg_catalog."default</w:t>
+      </w:r>
+      <w:proofErr w:type="spellEnd"/>
+      <w:r>
+        <w:t>",</w:t>
+      </w:r>
+    </w:p>
+    <w:p>
+      <w:pPr>
+        <w:pStyle w:val="NoSpacing"/>
+      </w:pPr>
+      <w:r>
+        <w:t xml:space="preserve">    CONSTRAINT </w:t>
+      </w:r>
+      <w:proofErr w:type="spellStart"/>
+      <w:r>
+        <w:t>isocodes_pkey</w:t>
+      </w:r>
+      <w:proofErr w:type="spellEnd"/>
+      <w:r>
+        <w:t xml:space="preserve"> PRIMARY KEY (</w:t>
+      </w:r>
+      <w:proofErr w:type="spellStart"/>
+      <w:r>
+        <w:t>isocode</w:t>
+      </w:r>
+      <w:proofErr w:type="spellEnd"/>
+      <w:r>
         <w:t>)</w:t>
       </w:r>
     </w:p>
     <w:p>
       <w:pPr>
-        <w:jc w:val="both"/>
-        <w:rPr>
-          <w:rFonts w:ascii="Calibri" w:hAnsi="Calibri" w:cs="Calibri"/>
-        </w:rPr>
-      </w:pPr>
+        <w:pStyle w:val="NoSpacing"/>
+      </w:pPr>
+      <w:r>
+        <w:t>)</w:t>
+      </w:r>
+    </w:p>
+    <w:p>
+      <w:pPr>
+        <w:pStyle w:val="NoSpacing"/>
+      </w:pPr>
+    </w:p>
+    <w:p>
+      <w:pPr>
+        <w:pStyle w:val="NoSpacing"/>
+      </w:pPr>
+      <w:r>
+        <w:t xml:space="preserve">TABLESPACE </w:t>
+      </w:r>
+      <w:proofErr w:type="spellStart"/>
+      <w:r>
+        <w:t>pg_default</w:t>
+      </w:r>
+      <w:proofErr w:type="spellEnd"/>
+      <w:r>
+        <w:t>;</w:t>
+      </w:r>
+    </w:p>
+    <w:p>
+      <w:pPr>
+        <w:pStyle w:val="NoSpacing"/>
+      </w:pPr>
+    </w:p>
+    <w:p>
+      <w:pPr>
+        <w:pStyle w:val="NoSpacing"/>
+      </w:pPr>
+      <w:r>
+        <w:t xml:space="preserve">ALTER TABLE IF EXISTS </w:t>
+      </w:r>
+      <w:proofErr w:type="spellStart"/>
+      <w:r>
+        <w:t>public.isocodes</w:t>
+      </w:r>
+      <w:proofErr w:type="spellEnd"/>
+    </w:p>
+    <w:p>
+      <w:pPr>
+        <w:pStyle w:val="NoSpacing"/>
+      </w:pPr>
+      <w:r>
+        <w:t xml:space="preserve">    OWNER to </w:t>
+      </w:r>
+      <w:proofErr w:type="spellStart"/>
+      <w:r>
+        <w:t>postgres</w:t>
+      </w:r>
+      <w:proofErr w:type="spellEnd"/>
+      <w:r>
+        <w:t>;</w:t>
+      </w:r>
+    </w:p>
+    <w:p>
+      <w:pPr>
+        <w:pStyle w:val="NoSpacing"/>
+      </w:pPr>
+    </w:p>
+    <w:p>
+      <w:pPr>
+        <w:pStyle w:val="NoSpacing"/>
+      </w:pPr>
+    </w:p>
+    <w:p>
+      <w:pPr>
+        <w:pStyle w:val="NoSpacing"/>
+      </w:pPr>
+    </w:p>
+    <w:p>
+      <w:pPr>
+        <w:pStyle w:val="NoSpacing"/>
+        <w:rPr>
+          <w:rFonts w:ascii="Calibri" w:hAnsi="Calibri" w:cs="Calibri"/>
+        </w:rPr>
+      </w:pPr>
+      <w:r>
+        <w:rPr>
+          <w:rFonts w:ascii="Calibri" w:hAnsi="Calibri" w:cs="Calibri"/>
+        </w:rPr>
+        <w:lastRenderedPageBreak/>
+        <w:t xml:space="preserve">-- Table: </w:t>
+      </w:r>
+      <w:proofErr w:type="spellStart"/>
+      <w:r>
+        <w:rPr>
+          <w:rFonts w:ascii="Calibri" w:hAnsi="Calibri" w:cs="Calibri"/>
+        </w:rPr>
+        <w:t>public.staging_allcountryenergy</w:t>
+      </w:r>
+      <w:proofErr w:type="spellEnd"/>
+    </w:p>
+    <w:p>
+      <w:pPr>
+        <w:pStyle w:val="NoSpacing"/>
+        <w:rPr>
+          <w:rFonts w:ascii="Calibri" w:hAnsi="Calibri" w:cs="Calibri"/>
+        </w:rPr>
+      </w:pPr>
+    </w:p>
+    <w:p>
+      <w:pPr>
+        <w:pStyle w:val="NoSpacing"/>
+        <w:rPr>
+          <w:rFonts w:ascii="Calibri" w:hAnsi="Calibri" w:cs="Calibri"/>
+        </w:rPr>
+      </w:pPr>
+      <w:r>
+        <w:rPr>
+          <w:rFonts w:ascii="Calibri" w:hAnsi="Calibri" w:cs="Calibri"/>
+        </w:rPr>
+        <w:t xml:space="preserve">-- DROP TABLE IF EXISTS </w:t>
+      </w:r>
+      <w:proofErr w:type="spellStart"/>
+      <w:r>
+        <w:rPr>
+          <w:rFonts w:ascii="Calibri" w:hAnsi="Calibri" w:cs="Calibri"/>
+        </w:rPr>
+        <w:t>public.staging_allcountryenergy</w:t>
+      </w:r>
+      <w:proofErr w:type="spellEnd"/>
+      <w:r>
+        <w:rPr>
+          <w:rFonts w:ascii="Calibri" w:hAnsi="Calibri" w:cs="Calibri"/>
+        </w:rPr>
+        <w:t>;</w:t>
+      </w:r>
+    </w:p>
+    <w:p>
+      <w:pPr>
+        <w:pStyle w:val="NoSpacing"/>
+        <w:rPr>
+          <w:rFonts w:ascii="Calibri" w:hAnsi="Calibri" w:cs="Calibri"/>
+        </w:rPr>
+      </w:pPr>
+    </w:p>
+    <w:p>
+      <w:pPr>
+        <w:pStyle w:val="NoSpacing"/>
+        <w:rPr>
+          <w:rFonts w:ascii="Calibri" w:hAnsi="Calibri" w:cs="Calibri"/>
+        </w:rPr>
+      </w:pPr>
+      <w:r>
+        <w:rPr>
+          <w:rFonts w:ascii="Calibri" w:hAnsi="Calibri" w:cs="Calibri"/>
+        </w:rPr>
+        <w:t xml:space="preserve">CREATE TABLE IF NOT EXISTS </w:t>
+      </w:r>
+      <w:proofErr w:type="spellStart"/>
+      <w:r>
+        <w:rPr>
+          <w:rFonts w:ascii="Calibri" w:hAnsi="Calibri" w:cs="Calibri"/>
+        </w:rPr>
+        <w:t>public.staging_allcountryenergy</w:t>
+      </w:r>
+      <w:proofErr w:type="spellEnd"/>
+    </w:p>
+    <w:p>
+      <w:pPr>
+        <w:pStyle w:val="NoSpacing"/>
+        <w:rPr>
+          <w:rFonts w:ascii="Calibri" w:hAnsi="Calibri" w:cs="Calibri"/>
+        </w:rPr>
+      </w:pPr>
+      <w:r>
+        <w:rPr>
+          <w:rFonts w:ascii="Calibri" w:hAnsi="Calibri" w:cs="Calibri"/>
+        </w:rPr>
+        <w:t>(</w:t>
+      </w:r>
+    </w:p>
+    <w:p>
+      <w:pPr>
+        <w:pStyle w:val="NoSpacing"/>
+        <w:rPr>
+          <w:rFonts w:ascii="Calibri" w:hAnsi="Calibri" w:cs="Calibri"/>
+        </w:rPr>
+      </w:pPr>
+      <w:r>
+        <w:rPr>
+          <w:rFonts w:ascii="Calibri" w:hAnsi="Calibri" w:cs="Calibri"/>
+        </w:rPr>
+        <w:t xml:space="preserve">    country text COLLATE </w:t>
+      </w:r>
+      <w:proofErr w:type="spellStart"/>
+      <w:r>
+        <w:rPr>
+          <w:rFonts w:ascii="Calibri" w:hAnsi="Calibri" w:cs="Calibri"/>
+        </w:rPr>
+        <w:t>pg_catalog."default</w:t>
+      </w:r>
+      <w:proofErr w:type="spellEnd"/>
+      <w:r>
+        <w:rPr>
+          <w:rFonts w:ascii="Calibri" w:hAnsi="Calibri" w:cs="Calibri"/>
+        </w:rPr>
+        <w:t>",</w:t>
+      </w:r>
+    </w:p>
+    <w:p>
+      <w:pPr>
+        <w:pStyle w:val="NoSpacing"/>
+        <w:rPr>
+          <w:rFonts w:ascii="Calibri" w:hAnsi="Calibri" w:cs="Calibri"/>
+        </w:rPr>
+      </w:pPr>
+      <w:r>
+        <w:rPr>
+          <w:rFonts w:ascii="Calibri" w:hAnsi="Calibri" w:cs="Calibri"/>
+        </w:rPr>
+        <w:t xml:space="preserve">    </w:t>
+      </w:r>
+      <w:proofErr w:type="spellStart"/>
+      <w:r>
+        <w:rPr>
+          <w:rFonts w:ascii="Calibri" w:hAnsi="Calibri" w:cs="Calibri"/>
+        </w:rPr>
+        <w:t>iso_code</w:t>
+      </w:r>
+      <w:proofErr w:type="spellEnd"/>
+      <w:r>
+        <w:rPr>
+          <w:rFonts w:ascii="Calibri" w:hAnsi="Calibri" w:cs="Calibri"/>
+        </w:rPr>
+        <w:t xml:space="preserve"> character varying(5) COLLATE </w:t>
+      </w:r>
+      <w:proofErr w:type="spellStart"/>
+      <w:r>
+        <w:rPr>
+          <w:rFonts w:ascii="Calibri" w:hAnsi="Calibri" w:cs="Calibri"/>
+        </w:rPr>
+        <w:t>pg_catalog."default</w:t>
+      </w:r>
+      <w:proofErr w:type="spellEnd"/>
+      <w:r>
+        <w:rPr>
+          <w:rFonts w:ascii="Calibri" w:hAnsi="Calibri" w:cs="Calibri"/>
+        </w:rPr>
+        <w:t>" ,</w:t>
+      </w:r>
+    </w:p>
+    <w:p>
+      <w:pPr>
+        <w:pStyle w:val="NoSpacing"/>
+        <w:rPr>
+          <w:rFonts w:ascii="Calibri" w:hAnsi="Calibri" w:cs="Calibri"/>
+        </w:rPr>
+      </w:pPr>
+      <w:r>
+        <w:rPr>
+          <w:rFonts w:ascii="Calibri" w:hAnsi="Calibri" w:cs="Calibri"/>
+        </w:rPr>
+        <w:t xml:space="preserve">    year integer,</w:t>
+      </w:r>
+    </w:p>
+    <w:p>
+      <w:pPr>
+        <w:pStyle w:val="NoSpacing"/>
+        <w:rPr>
+          <w:rFonts w:ascii="Calibri" w:hAnsi="Calibri" w:cs="Calibri"/>
+        </w:rPr>
+      </w:pPr>
+      <w:r>
+        <w:rPr>
+          <w:rFonts w:ascii="Calibri" w:hAnsi="Calibri" w:cs="Calibri"/>
+        </w:rPr>
+        <w:t xml:space="preserve">    </w:t>
+      </w:r>
+      <w:proofErr w:type="spellStart"/>
+      <w:r>
+        <w:rPr>
+          <w:rFonts w:ascii="Calibri" w:hAnsi="Calibri" w:cs="Calibri"/>
+        </w:rPr>
+        <w:t>biofuel_consumption</w:t>
+      </w:r>
+      <w:proofErr w:type="spellEnd"/>
+      <w:r>
+        <w:rPr>
+          <w:rFonts w:ascii="Calibri" w:hAnsi="Calibri" w:cs="Calibri"/>
+        </w:rPr>
+        <w:t xml:space="preserve"> integer,</w:t>
+      </w:r>
+    </w:p>
+    <w:p>
+      <w:pPr>
+        <w:pStyle w:val="NoSpacing"/>
+        <w:rPr>
+          <w:rFonts w:ascii="Calibri" w:hAnsi="Calibri" w:cs="Calibri"/>
+        </w:rPr>
+      </w:pPr>
+      <w:r>
+        <w:rPr>
+          <w:rFonts w:ascii="Calibri" w:hAnsi="Calibri" w:cs="Calibri"/>
+        </w:rPr>
+        <w:t xml:space="preserve">    </w:t>
+      </w:r>
+      <w:proofErr w:type="spellStart"/>
+      <w:r>
+        <w:rPr>
+          <w:rFonts w:ascii="Calibri" w:hAnsi="Calibri" w:cs="Calibri"/>
+        </w:rPr>
+        <w:t>coal_consumption</w:t>
+      </w:r>
+      <w:proofErr w:type="spellEnd"/>
+      <w:r>
+        <w:rPr>
+          <w:rFonts w:ascii="Calibri" w:hAnsi="Calibri" w:cs="Calibri"/>
+        </w:rPr>
+        <w:t xml:space="preserve"> integer,</w:t>
+      </w:r>
+    </w:p>
+    <w:p>
+      <w:pPr>
+        <w:pStyle w:val="NoSpacing"/>
+        <w:rPr>
+          <w:rFonts w:ascii="Calibri" w:hAnsi="Calibri" w:cs="Calibri"/>
+        </w:rPr>
+      </w:pPr>
+      <w:r>
+        <w:rPr>
+          <w:rFonts w:ascii="Calibri" w:hAnsi="Calibri" w:cs="Calibri"/>
+        </w:rPr>
+        <w:t xml:space="preserve">    </w:t>
+      </w:r>
+      <w:proofErr w:type="spellStart"/>
+      <w:r>
+        <w:rPr>
+          <w:rFonts w:ascii="Calibri" w:hAnsi="Calibri" w:cs="Calibri"/>
+        </w:rPr>
+        <w:t>coal_production</w:t>
+      </w:r>
+      <w:proofErr w:type="spellEnd"/>
+      <w:r>
+        <w:rPr>
+          <w:rFonts w:ascii="Calibri" w:hAnsi="Calibri" w:cs="Calibri"/>
+        </w:rPr>
+        <w:t xml:space="preserve"> integer,</w:t>
+      </w:r>
+    </w:p>
+    <w:p>
+      <w:pPr>
+        <w:pStyle w:val="NoSpacing"/>
+        <w:rPr>
+          <w:rFonts w:ascii="Calibri" w:hAnsi="Calibri" w:cs="Calibri"/>
+        </w:rPr>
+      </w:pPr>
+      <w:r>
+        <w:rPr>
+          <w:rFonts w:ascii="Calibri" w:hAnsi="Calibri" w:cs="Calibri"/>
+        </w:rPr>
+        <w:t xml:space="preserve">    </w:t>
+      </w:r>
+      <w:proofErr w:type="spellStart"/>
+      <w:r>
+        <w:rPr>
+          <w:rFonts w:ascii="Calibri" w:hAnsi="Calibri" w:cs="Calibri"/>
+        </w:rPr>
+        <w:t>electricity_demand</w:t>
+      </w:r>
+      <w:proofErr w:type="spellEnd"/>
+      <w:r>
+        <w:rPr>
+          <w:rFonts w:ascii="Calibri" w:hAnsi="Calibri" w:cs="Calibri"/>
+        </w:rPr>
+        <w:t xml:space="preserve"> integer,</w:t>
+      </w:r>
+    </w:p>
+    <w:p>
+      <w:pPr>
+        <w:pStyle w:val="NoSpacing"/>
+        <w:rPr>
+          <w:rFonts w:ascii="Calibri" w:hAnsi="Calibri" w:cs="Calibri"/>
+        </w:rPr>
+      </w:pPr>
+      <w:r>
+        <w:rPr>
+          <w:rFonts w:ascii="Calibri" w:hAnsi="Calibri" w:cs="Calibri"/>
+        </w:rPr>
+        <w:t xml:space="preserve">    </w:t>
+      </w:r>
+      <w:proofErr w:type="spellStart"/>
+      <w:r>
+        <w:rPr>
+          <w:rFonts w:ascii="Calibri" w:hAnsi="Calibri" w:cs="Calibri"/>
+        </w:rPr>
+        <w:t>biofuel_electricity</w:t>
+      </w:r>
+      <w:proofErr w:type="spellEnd"/>
+      <w:r>
+        <w:rPr>
+          <w:rFonts w:ascii="Calibri" w:hAnsi="Calibri" w:cs="Calibri"/>
+        </w:rPr>
+        <w:t xml:space="preserve"> integer,</w:t>
+      </w:r>
+    </w:p>
+    <w:p>
+      <w:pPr>
+        <w:pStyle w:val="NoSpacing"/>
+        <w:rPr>
+          <w:rFonts w:ascii="Calibri" w:hAnsi="Calibri" w:cs="Calibri"/>
+        </w:rPr>
+      </w:pPr>
+      <w:r>
+        <w:rPr>
+          <w:rFonts w:ascii="Calibri" w:hAnsi="Calibri" w:cs="Calibri"/>
+        </w:rPr>
+        <w:t xml:space="preserve">    </w:t>
+      </w:r>
+      <w:proofErr w:type="spellStart"/>
+      <w:r>
+        <w:rPr>
+          <w:rFonts w:ascii="Calibri" w:hAnsi="Calibri" w:cs="Calibri"/>
+        </w:rPr>
+        <w:t>coal_electricity</w:t>
+      </w:r>
+      <w:proofErr w:type="spellEnd"/>
+      <w:r>
+        <w:rPr>
+          <w:rFonts w:ascii="Calibri" w:hAnsi="Calibri" w:cs="Calibri"/>
+        </w:rPr>
+        <w:t xml:space="preserve"> integer,</w:t>
+      </w:r>
+    </w:p>
+    <w:p>
+      <w:pPr>
+        <w:pStyle w:val="NoSpacing"/>
+        <w:rPr>
+          <w:rFonts w:ascii="Calibri" w:hAnsi="Calibri" w:cs="Calibri"/>
+        </w:rPr>
+      </w:pPr>
+      <w:r>
+        <w:rPr>
+          <w:rFonts w:ascii="Calibri" w:hAnsi="Calibri" w:cs="Calibri"/>
+        </w:rPr>
+        <w:t xml:space="preserve">    </w:t>
+      </w:r>
+      <w:proofErr w:type="spellStart"/>
+      <w:r>
+        <w:rPr>
+          <w:rFonts w:ascii="Calibri" w:hAnsi="Calibri" w:cs="Calibri"/>
+        </w:rPr>
+        <w:t>fossil_electricity</w:t>
+      </w:r>
+      <w:proofErr w:type="spellEnd"/>
+      <w:r>
+        <w:rPr>
+          <w:rFonts w:ascii="Calibri" w:hAnsi="Calibri" w:cs="Calibri"/>
+        </w:rPr>
+        <w:t xml:space="preserve"> integer,</w:t>
+      </w:r>
+    </w:p>
+    <w:p>
+      <w:pPr>
+        <w:pStyle w:val="NoSpacing"/>
+        <w:rPr>
+          <w:rFonts w:ascii="Calibri" w:hAnsi="Calibri" w:cs="Calibri"/>
+        </w:rPr>
+      </w:pPr>
+      <w:r>
+        <w:rPr>
+          <w:rFonts w:ascii="Calibri" w:hAnsi="Calibri" w:cs="Calibri"/>
+        </w:rPr>
+        <w:t xml:space="preserve">    </w:t>
+      </w:r>
+      <w:proofErr w:type="spellStart"/>
+      <w:r>
+        <w:rPr>
+          <w:rFonts w:ascii="Calibri" w:hAnsi="Calibri" w:cs="Calibri"/>
+        </w:rPr>
+        <w:t>gas_electricity</w:t>
+      </w:r>
+      <w:proofErr w:type="spellEnd"/>
+      <w:r>
+        <w:rPr>
+          <w:rFonts w:ascii="Calibri" w:hAnsi="Calibri" w:cs="Calibri"/>
+        </w:rPr>
+        <w:t xml:space="preserve"> integer,</w:t>
+      </w:r>
+    </w:p>
+    <w:p>
+      <w:pPr>
+        <w:pStyle w:val="NoSpacing"/>
+        <w:rPr>
+          <w:rFonts w:ascii="Calibri" w:hAnsi="Calibri" w:cs="Calibri"/>
+        </w:rPr>
+      </w:pPr>
+      <w:r>
+        <w:rPr>
+          <w:rFonts w:ascii="Calibri" w:hAnsi="Calibri" w:cs="Calibri"/>
+        </w:rPr>
+        <w:t xml:space="preserve">    </w:t>
+      </w:r>
+      <w:proofErr w:type="spellStart"/>
+      <w:r>
+        <w:rPr>
+          <w:rFonts w:ascii="Calibri" w:hAnsi="Calibri" w:cs="Calibri"/>
+        </w:rPr>
+        <w:t>hydro_electricity</w:t>
+      </w:r>
+      <w:proofErr w:type="spellEnd"/>
+      <w:r>
+        <w:rPr>
+          <w:rFonts w:ascii="Calibri" w:hAnsi="Calibri" w:cs="Calibri"/>
+        </w:rPr>
+        <w:t xml:space="preserve"> integer,</w:t>
+      </w:r>
+    </w:p>
+    <w:p>
+      <w:pPr>
+        <w:pStyle w:val="NoSpacing"/>
+        <w:rPr>
+          <w:rFonts w:ascii="Calibri" w:hAnsi="Calibri" w:cs="Calibri"/>
+        </w:rPr>
+      </w:pPr>
+      <w:r>
+        <w:rPr>
+          <w:rFonts w:ascii="Calibri" w:hAnsi="Calibri" w:cs="Calibri"/>
+        </w:rPr>
+        <w:t xml:space="preserve">    </w:t>
+      </w:r>
+      <w:proofErr w:type="spellStart"/>
+      <w:r>
+        <w:rPr>
+          <w:rFonts w:ascii="Calibri" w:hAnsi="Calibri" w:cs="Calibri"/>
+        </w:rPr>
+        <w:t>nuclear_electricity</w:t>
+      </w:r>
+      <w:proofErr w:type="spellEnd"/>
+      <w:r>
+        <w:rPr>
+          <w:rFonts w:ascii="Calibri" w:hAnsi="Calibri" w:cs="Calibri"/>
+        </w:rPr>
+        <w:t xml:space="preserve"> integer,</w:t>
+      </w:r>
+    </w:p>
+    <w:p>
+      <w:pPr>
+        <w:pStyle w:val="NoSpacing"/>
+        <w:rPr>
+          <w:rFonts w:ascii="Calibri" w:hAnsi="Calibri" w:cs="Calibri"/>
+        </w:rPr>
+      </w:pPr>
+      <w:r>
+        <w:rPr>
+          <w:rFonts w:ascii="Calibri" w:hAnsi="Calibri" w:cs="Calibri"/>
+        </w:rPr>
+        <w:t xml:space="preserve">    </w:t>
+      </w:r>
+      <w:proofErr w:type="spellStart"/>
+      <w:r>
+        <w:rPr>
+          <w:rFonts w:ascii="Calibri" w:hAnsi="Calibri" w:cs="Calibri"/>
+        </w:rPr>
+        <w:t>oil_electricity</w:t>
+      </w:r>
+      <w:proofErr w:type="spellEnd"/>
+      <w:r>
+        <w:rPr>
+          <w:rFonts w:ascii="Calibri" w:hAnsi="Calibri" w:cs="Calibri"/>
+        </w:rPr>
+        <w:t xml:space="preserve"> integer,</w:t>
+      </w:r>
+    </w:p>
+    <w:p>
+      <w:pPr>
+        <w:pStyle w:val="NoSpacing"/>
+        <w:rPr>
+          <w:rFonts w:ascii="Calibri" w:hAnsi="Calibri" w:cs="Calibri"/>
+        </w:rPr>
+      </w:pPr>
+      <w:r>
+        <w:rPr>
+          <w:rFonts w:ascii="Calibri" w:hAnsi="Calibri" w:cs="Calibri"/>
+        </w:rPr>
+        <w:t xml:space="preserve">    </w:t>
+      </w:r>
+      <w:proofErr w:type="spellStart"/>
+      <w:r>
+        <w:rPr>
+          <w:rFonts w:ascii="Calibri" w:hAnsi="Calibri" w:cs="Calibri"/>
+        </w:rPr>
+        <w:t>other_renewable_exc_biofuel_electricity</w:t>
+      </w:r>
+      <w:proofErr w:type="spellEnd"/>
+      <w:r>
+        <w:rPr>
+          <w:rFonts w:ascii="Calibri" w:hAnsi="Calibri" w:cs="Calibri"/>
+        </w:rPr>
+        <w:t xml:space="preserve"> integer,</w:t>
+      </w:r>
+    </w:p>
+    <w:p>
+      <w:pPr>
+        <w:pStyle w:val="NoSpacing"/>
+        <w:rPr>
+          <w:rFonts w:ascii="Calibri" w:hAnsi="Calibri" w:cs="Calibri"/>
+        </w:rPr>
+      </w:pPr>
+      <w:r>
+        <w:rPr>
+          <w:rFonts w:ascii="Calibri" w:hAnsi="Calibri" w:cs="Calibri"/>
+        </w:rPr>
+        <w:t xml:space="preserve">    </w:t>
+      </w:r>
+      <w:proofErr w:type="spellStart"/>
+      <w:r>
+        <w:rPr>
+          <w:rFonts w:ascii="Calibri" w:hAnsi="Calibri" w:cs="Calibri"/>
+        </w:rPr>
+        <w:t>other_renewable_electricity</w:t>
+      </w:r>
+      <w:proofErr w:type="spellEnd"/>
+      <w:r>
+        <w:rPr>
+          <w:rFonts w:ascii="Calibri" w:hAnsi="Calibri" w:cs="Calibri"/>
+        </w:rPr>
+        <w:t xml:space="preserve"> integer,</w:t>
+      </w:r>
+    </w:p>
+    <w:p>
+      <w:pPr>
+        <w:pStyle w:val="NoSpacing"/>
+        <w:rPr>
+          <w:rFonts w:ascii="Calibri" w:hAnsi="Calibri" w:cs="Calibri"/>
+        </w:rPr>
+      </w:pPr>
+      <w:r>
+        <w:rPr>
+          <w:rFonts w:ascii="Calibri" w:hAnsi="Calibri" w:cs="Calibri"/>
+        </w:rPr>
+        <w:t xml:space="preserve">    </w:t>
+      </w:r>
+      <w:proofErr w:type="spellStart"/>
+      <w:r>
+        <w:rPr>
+          <w:rFonts w:ascii="Calibri" w:hAnsi="Calibri" w:cs="Calibri"/>
+        </w:rPr>
+        <w:t>renewables_electricity</w:t>
+      </w:r>
+      <w:proofErr w:type="spellEnd"/>
+      <w:r>
+        <w:rPr>
+          <w:rFonts w:ascii="Calibri" w:hAnsi="Calibri" w:cs="Calibri"/>
+        </w:rPr>
+        <w:t xml:space="preserve"> integer,</w:t>
+      </w:r>
+    </w:p>
+    <w:p>
+      <w:pPr>
+        <w:pStyle w:val="NoSpacing"/>
+        <w:rPr>
+          <w:rFonts w:ascii="Calibri" w:hAnsi="Calibri" w:cs="Calibri"/>
+        </w:rPr>
+      </w:pPr>
+      <w:r>
+        <w:rPr>
+          <w:rFonts w:ascii="Calibri" w:hAnsi="Calibri" w:cs="Calibri"/>
+        </w:rPr>
+        <w:t xml:space="preserve">    </w:t>
+      </w:r>
+      <w:proofErr w:type="spellStart"/>
+      <w:r>
+        <w:rPr>
+          <w:rFonts w:ascii="Calibri" w:hAnsi="Calibri" w:cs="Calibri"/>
+        </w:rPr>
+        <w:t>solar_electricity</w:t>
+      </w:r>
+      <w:proofErr w:type="spellEnd"/>
+      <w:r>
+        <w:rPr>
+          <w:rFonts w:ascii="Calibri" w:hAnsi="Calibri" w:cs="Calibri"/>
+        </w:rPr>
+        <w:t xml:space="preserve"> integer,</w:t>
+      </w:r>
+    </w:p>
+    <w:p>
+      <w:pPr>
+        <w:pStyle w:val="NoSpacing"/>
+        <w:rPr>
+          <w:rFonts w:ascii="Calibri" w:hAnsi="Calibri" w:cs="Calibri"/>
+        </w:rPr>
+      </w:pPr>
+      <w:r>
+        <w:rPr>
+          <w:rFonts w:ascii="Calibri" w:hAnsi="Calibri" w:cs="Calibri"/>
+        </w:rPr>
+        <w:t xml:space="preserve">    </w:t>
+      </w:r>
+      <w:proofErr w:type="spellStart"/>
+      <w:r>
+        <w:rPr>
+          <w:rFonts w:ascii="Calibri" w:hAnsi="Calibri" w:cs="Calibri"/>
+        </w:rPr>
+        <w:t>wind_electricity</w:t>
+      </w:r>
+      <w:proofErr w:type="spellEnd"/>
+      <w:r>
+        <w:rPr>
+          <w:rFonts w:ascii="Calibri" w:hAnsi="Calibri" w:cs="Calibri"/>
+        </w:rPr>
+        <w:t xml:space="preserve"> integer,</w:t>
+      </w:r>
+    </w:p>
+    <w:p>
+      <w:pPr>
+        <w:pStyle w:val="NoSpacing"/>
+        <w:rPr>
+          <w:rFonts w:ascii="Calibri" w:hAnsi="Calibri" w:cs="Calibri"/>
+        </w:rPr>
+      </w:pPr>
+      <w:r>
+        <w:rPr>
+          <w:rFonts w:ascii="Calibri" w:hAnsi="Calibri" w:cs="Calibri"/>
+        </w:rPr>
+        <w:t xml:space="preserve">    </w:t>
+      </w:r>
+      <w:proofErr w:type="spellStart"/>
+      <w:r>
+        <w:rPr>
+          <w:rFonts w:ascii="Calibri" w:hAnsi="Calibri" w:cs="Calibri"/>
+        </w:rPr>
+        <w:t>electricity_generation</w:t>
+      </w:r>
+      <w:proofErr w:type="spellEnd"/>
+      <w:r>
+        <w:rPr>
+          <w:rFonts w:ascii="Calibri" w:hAnsi="Calibri" w:cs="Calibri"/>
+        </w:rPr>
+        <w:t xml:space="preserve"> integer,</w:t>
+      </w:r>
+    </w:p>
+    <w:p>
+      <w:pPr>
+        <w:pStyle w:val="NoSpacing"/>
+        <w:rPr>
+          <w:rFonts w:ascii="Calibri" w:hAnsi="Calibri" w:cs="Calibri"/>
+        </w:rPr>
+      </w:pPr>
+      <w:r>
+        <w:rPr>
+          <w:rFonts w:ascii="Calibri" w:hAnsi="Calibri" w:cs="Calibri"/>
+        </w:rPr>
+        <w:t xml:space="preserve">    </w:t>
+      </w:r>
+      <w:proofErr w:type="spellStart"/>
+      <w:r>
+        <w:rPr>
+          <w:rFonts w:ascii="Calibri" w:hAnsi="Calibri" w:cs="Calibri"/>
+        </w:rPr>
+        <w:t>fossil_fuel_consumption</w:t>
+      </w:r>
+      <w:proofErr w:type="spellEnd"/>
+      <w:r>
+        <w:rPr>
+          <w:rFonts w:ascii="Calibri" w:hAnsi="Calibri" w:cs="Calibri"/>
+        </w:rPr>
+        <w:t xml:space="preserve"> integer,</w:t>
+      </w:r>
+    </w:p>
+    <w:p>
+      <w:pPr>
+        <w:pStyle w:val="NoSpacing"/>
+        <w:rPr>
+          <w:rFonts w:ascii="Calibri" w:hAnsi="Calibri" w:cs="Calibri"/>
+        </w:rPr>
+      </w:pPr>
+      <w:r>
+        <w:rPr>
+          <w:rFonts w:ascii="Calibri" w:hAnsi="Calibri" w:cs="Calibri"/>
+        </w:rPr>
+        <w:t xml:space="preserve">    </w:t>
+      </w:r>
+      <w:proofErr w:type="spellStart"/>
+      <w:r>
+        <w:rPr>
+          <w:rFonts w:ascii="Calibri" w:hAnsi="Calibri" w:cs="Calibri"/>
+        </w:rPr>
+        <w:t>gas_consumption</w:t>
+      </w:r>
+      <w:proofErr w:type="spellEnd"/>
+      <w:r>
+        <w:rPr>
+          <w:rFonts w:ascii="Calibri" w:hAnsi="Calibri" w:cs="Calibri"/>
+        </w:rPr>
+        <w:t xml:space="preserve"> integer,</w:t>
+      </w:r>
+    </w:p>
+    <w:p>
+      <w:pPr>
+        <w:pStyle w:val="NoSpacing"/>
+        <w:rPr>
+          <w:rFonts w:ascii="Calibri" w:hAnsi="Calibri" w:cs="Calibri"/>
+        </w:rPr>
+      </w:pPr>
+      <w:r>
+        <w:rPr>
+          <w:rFonts w:ascii="Calibri" w:hAnsi="Calibri" w:cs="Calibri"/>
+        </w:rPr>
+        <w:t xml:space="preserve">    </w:t>
+      </w:r>
+      <w:proofErr w:type="spellStart"/>
+      <w:r>
+        <w:rPr>
+          <w:rFonts w:ascii="Calibri" w:hAnsi="Calibri" w:cs="Calibri"/>
+        </w:rPr>
+        <w:t>gas_production</w:t>
+      </w:r>
+      <w:proofErr w:type="spellEnd"/>
+      <w:r>
+        <w:rPr>
+          <w:rFonts w:ascii="Calibri" w:hAnsi="Calibri" w:cs="Calibri"/>
+        </w:rPr>
+        <w:t xml:space="preserve"> integer,</w:t>
+      </w:r>
+    </w:p>
+    <w:p>
+      <w:pPr>
+        <w:pStyle w:val="NoSpacing"/>
+        <w:rPr>
+          <w:rFonts w:ascii="Calibri" w:hAnsi="Calibri" w:cs="Calibri"/>
+        </w:rPr>
+      </w:pPr>
+      <w:r>
+        <w:rPr>
+          <w:rFonts w:ascii="Calibri" w:hAnsi="Calibri" w:cs="Calibri"/>
+        </w:rPr>
+        <w:t xml:space="preserve">    </w:t>
+      </w:r>
+      <w:proofErr w:type="spellStart"/>
+      <w:r>
+        <w:rPr>
+          <w:rFonts w:ascii="Calibri" w:hAnsi="Calibri" w:cs="Calibri"/>
+        </w:rPr>
+        <w:t>hydro_consumption</w:t>
+      </w:r>
+      <w:proofErr w:type="spellEnd"/>
+      <w:r>
+        <w:rPr>
+          <w:rFonts w:ascii="Calibri" w:hAnsi="Calibri" w:cs="Calibri"/>
+        </w:rPr>
+        <w:t xml:space="preserve"> integer,</w:t>
+      </w:r>
+    </w:p>
+    <w:p>
+      <w:pPr>
+        <w:pStyle w:val="NoSpacing"/>
+        <w:rPr>
+          <w:rFonts w:ascii="Calibri" w:hAnsi="Calibri" w:cs="Calibri"/>
+        </w:rPr>
+      </w:pPr>
+      <w:r>
+        <w:rPr>
+          <w:rFonts w:ascii="Calibri" w:hAnsi="Calibri" w:cs="Calibri"/>
+        </w:rPr>
+        <w:t xml:space="preserve">    </w:t>
+      </w:r>
+      <w:proofErr w:type="spellStart"/>
+      <w:r>
+        <w:rPr>
+          <w:rFonts w:ascii="Calibri" w:hAnsi="Calibri" w:cs="Calibri"/>
+        </w:rPr>
+        <w:t>low_carbon_consumption</w:t>
+      </w:r>
+      <w:proofErr w:type="spellEnd"/>
+      <w:r>
+        <w:rPr>
+          <w:rFonts w:ascii="Calibri" w:hAnsi="Calibri" w:cs="Calibri"/>
+        </w:rPr>
+        <w:t xml:space="preserve"> integer,</w:t>
+      </w:r>
+    </w:p>
+    <w:p>
+      <w:pPr>
+        <w:pStyle w:val="NoSpacing"/>
+        <w:rPr>
+          <w:rFonts w:ascii="Calibri" w:hAnsi="Calibri" w:cs="Calibri"/>
+        </w:rPr>
+      </w:pPr>
+      <w:r>
+        <w:rPr>
+          <w:rFonts w:ascii="Calibri" w:hAnsi="Calibri" w:cs="Calibri"/>
+        </w:rPr>
+        <w:t xml:space="preserve">    </w:t>
+      </w:r>
+      <w:proofErr w:type="spellStart"/>
+      <w:r>
+        <w:rPr>
+          <w:rFonts w:ascii="Calibri" w:hAnsi="Calibri" w:cs="Calibri"/>
+        </w:rPr>
+        <w:t>nuclear_consumption</w:t>
+      </w:r>
+      <w:proofErr w:type="spellEnd"/>
+      <w:r>
+        <w:rPr>
+          <w:rFonts w:ascii="Calibri" w:hAnsi="Calibri" w:cs="Calibri"/>
+        </w:rPr>
+        <w:t xml:space="preserve"> integer,</w:t>
+      </w:r>
+    </w:p>
+    <w:p>
+      <w:pPr>
+        <w:pStyle w:val="NoSpacing"/>
+        <w:rPr>
+          <w:rFonts w:ascii="Calibri" w:hAnsi="Calibri" w:cs="Calibri"/>
+        </w:rPr>
+      </w:pPr>
+      <w:r>
+        <w:rPr>
+          <w:rFonts w:ascii="Calibri" w:hAnsi="Calibri" w:cs="Calibri"/>
+        </w:rPr>
+        <w:t xml:space="preserve">    </w:t>
+      </w:r>
+      <w:proofErr w:type="spellStart"/>
+      <w:r>
+        <w:rPr>
+          <w:rFonts w:ascii="Calibri" w:hAnsi="Calibri" w:cs="Calibri"/>
+        </w:rPr>
+        <w:t>oil_consumption</w:t>
+      </w:r>
+      <w:proofErr w:type="spellEnd"/>
+      <w:r>
+        <w:rPr>
+          <w:rFonts w:ascii="Calibri" w:hAnsi="Calibri" w:cs="Calibri"/>
+        </w:rPr>
+        <w:t xml:space="preserve"> integer,</w:t>
+      </w:r>
+    </w:p>
+    <w:p>
+      <w:pPr>
+        <w:pStyle w:val="NoSpacing"/>
+        <w:rPr>
+          <w:rFonts w:ascii="Calibri" w:hAnsi="Calibri" w:cs="Calibri"/>
+        </w:rPr>
+      </w:pPr>
+      <w:r>
+        <w:rPr>
+          <w:rFonts w:ascii="Calibri" w:hAnsi="Calibri" w:cs="Calibri"/>
+        </w:rPr>
+        <w:t xml:space="preserve">    </w:t>
+      </w:r>
+      <w:proofErr w:type="spellStart"/>
+      <w:r>
+        <w:rPr>
+          <w:rFonts w:ascii="Calibri" w:hAnsi="Calibri" w:cs="Calibri"/>
+        </w:rPr>
+        <w:t>oil_production</w:t>
+      </w:r>
+      <w:proofErr w:type="spellEnd"/>
+      <w:r>
+        <w:rPr>
+          <w:rFonts w:ascii="Calibri" w:hAnsi="Calibri" w:cs="Calibri"/>
+        </w:rPr>
+        <w:t xml:space="preserve"> integer,</w:t>
+      </w:r>
+    </w:p>
+    <w:p>
+      <w:pPr>
+        <w:pStyle w:val="NoSpacing"/>
+        <w:rPr>
+          <w:rFonts w:ascii="Calibri" w:hAnsi="Calibri" w:cs="Calibri"/>
+        </w:rPr>
+      </w:pPr>
+      <w:r>
+        <w:rPr>
+          <w:rFonts w:ascii="Calibri" w:hAnsi="Calibri" w:cs="Calibri"/>
+        </w:rPr>
+        <w:t xml:space="preserve">    </w:t>
+      </w:r>
+      <w:proofErr w:type="spellStart"/>
+      <w:r>
+        <w:rPr>
+          <w:rFonts w:ascii="Calibri" w:hAnsi="Calibri" w:cs="Calibri"/>
+        </w:rPr>
+        <w:t>other_renewables_cons_change_pct</w:t>
+      </w:r>
+      <w:proofErr w:type="spellEnd"/>
+      <w:r>
+        <w:rPr>
+          <w:rFonts w:ascii="Calibri" w:hAnsi="Calibri" w:cs="Calibri"/>
+        </w:rPr>
+        <w:t xml:space="preserve"> integer,</w:t>
+      </w:r>
+    </w:p>
+    <w:p>
+      <w:pPr>
+        <w:pStyle w:val="NoSpacing"/>
+        <w:rPr>
+          <w:rFonts w:ascii="Calibri" w:hAnsi="Calibri" w:cs="Calibri"/>
+        </w:rPr>
+      </w:pPr>
+      <w:r>
+        <w:rPr>
+          <w:rFonts w:ascii="Calibri" w:hAnsi="Calibri" w:cs="Calibri"/>
+        </w:rPr>
+        <w:t xml:space="preserve">    </w:t>
+      </w:r>
+      <w:proofErr w:type="spellStart"/>
+      <w:r>
+        <w:rPr>
+          <w:rFonts w:ascii="Calibri" w:hAnsi="Calibri" w:cs="Calibri"/>
+        </w:rPr>
+        <w:t>other_renewables_share_energy</w:t>
+      </w:r>
+      <w:proofErr w:type="spellEnd"/>
+      <w:r>
+        <w:rPr>
+          <w:rFonts w:ascii="Calibri" w:hAnsi="Calibri" w:cs="Calibri"/>
+        </w:rPr>
+        <w:t xml:space="preserve"> integer,</w:t>
+      </w:r>
+    </w:p>
+    <w:p>
+      <w:pPr>
+        <w:pStyle w:val="NoSpacing"/>
+        <w:rPr>
+          <w:rFonts w:ascii="Calibri" w:hAnsi="Calibri" w:cs="Calibri"/>
+        </w:rPr>
+      </w:pPr>
+      <w:r>
+        <w:rPr>
+          <w:rFonts w:ascii="Calibri" w:hAnsi="Calibri" w:cs="Calibri"/>
+        </w:rPr>
+        <w:t xml:space="preserve">    </w:t>
+      </w:r>
+      <w:proofErr w:type="spellStart"/>
+      <w:r>
+        <w:rPr>
+          <w:rFonts w:ascii="Calibri" w:hAnsi="Calibri" w:cs="Calibri"/>
+        </w:rPr>
+        <w:t>other_renewables_cons_change_twh</w:t>
+      </w:r>
+      <w:proofErr w:type="spellEnd"/>
+      <w:r>
+        <w:rPr>
+          <w:rFonts w:ascii="Calibri" w:hAnsi="Calibri" w:cs="Calibri"/>
+        </w:rPr>
+        <w:t xml:space="preserve"> integer,</w:t>
+      </w:r>
+    </w:p>
+    <w:p>
+      <w:pPr>
+        <w:pStyle w:val="NoSpacing"/>
+        <w:rPr>
+          <w:rFonts w:ascii="Calibri" w:hAnsi="Calibri" w:cs="Calibri"/>
+        </w:rPr>
+      </w:pPr>
+      <w:r>
+        <w:rPr>
+          <w:rFonts w:ascii="Calibri" w:hAnsi="Calibri" w:cs="Calibri"/>
+        </w:rPr>
+        <w:t xml:space="preserve">    </w:t>
+      </w:r>
+      <w:proofErr w:type="spellStart"/>
+      <w:r>
+        <w:rPr>
+          <w:rFonts w:ascii="Calibri" w:hAnsi="Calibri" w:cs="Calibri"/>
+        </w:rPr>
+        <w:t>other_renewable_consumption</w:t>
+      </w:r>
+      <w:proofErr w:type="spellEnd"/>
+      <w:r>
+        <w:rPr>
+          <w:rFonts w:ascii="Calibri" w:hAnsi="Calibri" w:cs="Calibri"/>
+        </w:rPr>
+        <w:t xml:space="preserve"> integer,</w:t>
+      </w:r>
+    </w:p>
+    <w:p>
+      <w:pPr>
+        <w:pStyle w:val="NoSpacing"/>
+        <w:rPr>
+          <w:rFonts w:ascii="Calibri" w:hAnsi="Calibri" w:cs="Calibri"/>
+        </w:rPr>
+      </w:pPr>
+      <w:r>
+        <w:rPr>
+          <w:rFonts w:ascii="Calibri" w:hAnsi="Calibri" w:cs="Calibri"/>
+        </w:rPr>
+        <w:t xml:space="preserve">    </w:t>
+      </w:r>
+      <w:proofErr w:type="spellStart"/>
+      <w:r>
+        <w:rPr>
+          <w:rFonts w:ascii="Calibri" w:hAnsi="Calibri" w:cs="Calibri"/>
+        </w:rPr>
+        <w:t>other_renewables_share_elec</w:t>
+      </w:r>
+      <w:proofErr w:type="spellEnd"/>
+      <w:r>
+        <w:rPr>
+          <w:rFonts w:ascii="Calibri" w:hAnsi="Calibri" w:cs="Calibri"/>
+        </w:rPr>
+        <w:t xml:space="preserve"> integer,</w:t>
+      </w:r>
+    </w:p>
+    <w:p>
+      <w:pPr>
+        <w:pStyle w:val="NoSpacing"/>
+        <w:rPr>
+          <w:rFonts w:ascii="Calibri" w:hAnsi="Calibri" w:cs="Calibri"/>
+        </w:rPr>
+      </w:pPr>
+      <w:r>
+        <w:rPr>
+          <w:rFonts w:ascii="Calibri" w:hAnsi="Calibri" w:cs="Calibri"/>
+        </w:rPr>
+        <w:t xml:space="preserve">    </w:t>
+      </w:r>
+      <w:proofErr w:type="spellStart"/>
+      <w:r>
+        <w:rPr>
+          <w:rFonts w:ascii="Calibri" w:hAnsi="Calibri" w:cs="Calibri"/>
+        </w:rPr>
+        <w:t>primary_energy_consumption</w:t>
+      </w:r>
+      <w:proofErr w:type="spellEnd"/>
+      <w:r>
+        <w:rPr>
+          <w:rFonts w:ascii="Calibri" w:hAnsi="Calibri" w:cs="Calibri"/>
+        </w:rPr>
+        <w:t xml:space="preserve"> integer,</w:t>
+      </w:r>
+    </w:p>
+    <w:p>
+      <w:pPr>
+        <w:pStyle w:val="NoSpacing"/>
+        <w:rPr>
+          <w:rFonts w:ascii="Calibri" w:hAnsi="Calibri" w:cs="Calibri"/>
+        </w:rPr>
+      </w:pPr>
+      <w:r>
+        <w:rPr>
+          <w:rFonts w:ascii="Calibri" w:hAnsi="Calibri" w:cs="Calibri"/>
+        </w:rPr>
+        <w:t xml:space="preserve">    </w:t>
+      </w:r>
+      <w:proofErr w:type="spellStart"/>
+      <w:r>
+        <w:rPr>
+          <w:rFonts w:ascii="Calibri" w:hAnsi="Calibri" w:cs="Calibri"/>
+        </w:rPr>
+        <w:t>renewables_share_elec</w:t>
+      </w:r>
+      <w:proofErr w:type="spellEnd"/>
+      <w:r>
+        <w:rPr>
+          <w:rFonts w:ascii="Calibri" w:hAnsi="Calibri" w:cs="Calibri"/>
+        </w:rPr>
+        <w:t xml:space="preserve"> integer,</w:t>
+      </w:r>
+    </w:p>
+    <w:p>
+      <w:pPr>
+        <w:pStyle w:val="NoSpacing"/>
+        <w:rPr>
+          <w:rFonts w:ascii="Calibri" w:hAnsi="Calibri" w:cs="Calibri"/>
+        </w:rPr>
+      </w:pPr>
+      <w:r>
+        <w:rPr>
+          <w:rFonts w:ascii="Calibri" w:hAnsi="Calibri" w:cs="Calibri"/>
+        </w:rPr>
+        <w:t xml:space="preserve">    </w:t>
+      </w:r>
+      <w:proofErr w:type="spellStart"/>
+      <w:r>
+        <w:rPr>
+          <w:rFonts w:ascii="Calibri" w:hAnsi="Calibri" w:cs="Calibri"/>
+        </w:rPr>
+        <w:t>renewables_share_energy</w:t>
+      </w:r>
+      <w:proofErr w:type="spellEnd"/>
+      <w:r>
+        <w:rPr>
+          <w:rFonts w:ascii="Calibri" w:hAnsi="Calibri" w:cs="Calibri"/>
+        </w:rPr>
+        <w:t xml:space="preserve"> integer,</w:t>
+      </w:r>
+    </w:p>
+    <w:p>
+      <w:pPr>
+        <w:pStyle w:val="NoSpacing"/>
+        <w:rPr>
+          <w:rFonts w:ascii="Calibri" w:hAnsi="Calibri" w:cs="Calibri"/>
+        </w:rPr>
+      </w:pPr>
+      <w:r>
+        <w:rPr>
+          <w:rFonts w:ascii="Calibri" w:hAnsi="Calibri" w:cs="Calibri"/>
+        </w:rPr>
+        <w:t xml:space="preserve">    </w:t>
+      </w:r>
+      <w:proofErr w:type="spellStart"/>
+      <w:r>
+        <w:rPr>
+          <w:rFonts w:ascii="Calibri" w:hAnsi="Calibri" w:cs="Calibri"/>
+        </w:rPr>
+        <w:t>renewables_consumption</w:t>
+      </w:r>
+      <w:proofErr w:type="spellEnd"/>
+      <w:r>
+        <w:rPr>
+          <w:rFonts w:ascii="Calibri" w:hAnsi="Calibri" w:cs="Calibri"/>
+        </w:rPr>
+        <w:t xml:space="preserve"> integer,</w:t>
+      </w:r>
+    </w:p>
+    <w:p>
+      <w:pPr>
+        <w:pStyle w:val="NoSpacing"/>
+        <w:rPr>
+          <w:rFonts w:ascii="Calibri" w:hAnsi="Calibri" w:cs="Calibri"/>
+        </w:rPr>
+      </w:pPr>
+      <w:r>
+        <w:rPr>
+          <w:rFonts w:ascii="Calibri" w:hAnsi="Calibri" w:cs="Calibri"/>
+        </w:rPr>
+        <w:t xml:space="preserve">    </w:t>
+      </w:r>
+      <w:proofErr w:type="spellStart"/>
+      <w:r>
+        <w:rPr>
+          <w:rFonts w:ascii="Calibri" w:hAnsi="Calibri" w:cs="Calibri"/>
+        </w:rPr>
+        <w:t>solar_share_elec</w:t>
+      </w:r>
+      <w:proofErr w:type="spellEnd"/>
+      <w:r>
+        <w:rPr>
+          <w:rFonts w:ascii="Calibri" w:hAnsi="Calibri" w:cs="Calibri"/>
+        </w:rPr>
+        <w:t xml:space="preserve"> integer,</w:t>
+      </w:r>
+    </w:p>
+    <w:p>
+      <w:pPr>
+        <w:pStyle w:val="NoSpacing"/>
+        <w:rPr>
+          <w:rFonts w:ascii="Calibri" w:hAnsi="Calibri" w:cs="Calibri"/>
+        </w:rPr>
+      </w:pPr>
+      <w:r>
+        <w:rPr>
+          <w:rFonts w:ascii="Calibri" w:hAnsi="Calibri" w:cs="Calibri"/>
+        </w:rPr>
+        <w:lastRenderedPageBreak/>
+        <w:t xml:space="preserve">    </w:t>
+      </w:r>
+      <w:proofErr w:type="spellStart"/>
+      <w:r>
+        <w:rPr>
+          <w:rFonts w:ascii="Calibri" w:hAnsi="Calibri" w:cs="Calibri"/>
+        </w:rPr>
+        <w:t>solar_share_energy</w:t>
+      </w:r>
+      <w:proofErr w:type="spellEnd"/>
+      <w:r>
+        <w:rPr>
+          <w:rFonts w:ascii="Calibri" w:hAnsi="Calibri" w:cs="Calibri"/>
+        </w:rPr>
+        <w:t xml:space="preserve"> integer,</w:t>
+      </w:r>
+    </w:p>
+    <w:p>
+      <w:pPr>
+        <w:pStyle w:val="NoSpacing"/>
+        <w:rPr>
+          <w:rFonts w:ascii="Calibri" w:hAnsi="Calibri" w:cs="Calibri"/>
+        </w:rPr>
+      </w:pPr>
+      <w:r>
+        <w:rPr>
+          <w:rFonts w:ascii="Calibri" w:hAnsi="Calibri" w:cs="Calibri"/>
+        </w:rPr>
+        <w:t xml:space="preserve">    </w:t>
+      </w:r>
+      <w:proofErr w:type="spellStart"/>
+      <w:r>
+        <w:rPr>
+          <w:rFonts w:ascii="Calibri" w:hAnsi="Calibri" w:cs="Calibri"/>
+        </w:rPr>
+        <w:t>solar_consumption</w:t>
+      </w:r>
+      <w:proofErr w:type="spellEnd"/>
+      <w:r>
+        <w:rPr>
+          <w:rFonts w:ascii="Calibri" w:hAnsi="Calibri" w:cs="Calibri"/>
+        </w:rPr>
+        <w:t xml:space="preserve"> integer,</w:t>
+      </w:r>
+    </w:p>
+    <w:p>
+      <w:pPr>
+        <w:pStyle w:val="NoSpacing"/>
+        <w:rPr>
+          <w:rFonts w:ascii="Calibri" w:hAnsi="Calibri" w:cs="Calibri"/>
+        </w:rPr>
+      </w:pPr>
+      <w:r>
+        <w:rPr>
+          <w:rFonts w:ascii="Calibri" w:hAnsi="Calibri" w:cs="Calibri"/>
+        </w:rPr>
+        <w:t xml:space="preserve">    </w:t>
+      </w:r>
+      <w:proofErr w:type="spellStart"/>
+      <w:r>
+        <w:rPr>
+          <w:rFonts w:ascii="Calibri" w:hAnsi="Calibri" w:cs="Calibri"/>
+        </w:rPr>
+        <w:t>wind_share_elec</w:t>
+      </w:r>
+      <w:proofErr w:type="spellEnd"/>
+      <w:r>
+        <w:rPr>
+          <w:rFonts w:ascii="Calibri" w:hAnsi="Calibri" w:cs="Calibri"/>
+        </w:rPr>
+        <w:t xml:space="preserve"> integer,</w:t>
+      </w:r>
+    </w:p>
+    <w:p>
+      <w:pPr>
+        <w:pStyle w:val="NoSpacing"/>
+        <w:rPr>
+          <w:rFonts w:ascii="Calibri" w:hAnsi="Calibri" w:cs="Calibri"/>
+        </w:rPr>
+      </w:pPr>
+      <w:r>
+        <w:rPr>
+          <w:rFonts w:ascii="Calibri" w:hAnsi="Calibri" w:cs="Calibri"/>
+        </w:rPr>
+        <w:t xml:space="preserve">    </w:t>
+      </w:r>
+      <w:proofErr w:type="spellStart"/>
+      <w:r>
+        <w:rPr>
+          <w:rFonts w:ascii="Calibri" w:hAnsi="Calibri" w:cs="Calibri"/>
+        </w:rPr>
+        <w:t>wind_share_energy</w:t>
+      </w:r>
+      <w:proofErr w:type="spellEnd"/>
+      <w:r>
+        <w:rPr>
+          <w:rFonts w:ascii="Calibri" w:hAnsi="Calibri" w:cs="Calibri"/>
+        </w:rPr>
+        <w:t xml:space="preserve"> integer,</w:t>
+      </w:r>
+    </w:p>
+    <w:p>
+      <w:pPr>
+        <w:pStyle w:val="NoSpacing"/>
+        <w:rPr>
+          <w:rFonts w:ascii="Calibri" w:hAnsi="Calibri" w:cs="Calibri"/>
+        </w:rPr>
+      </w:pPr>
+      <w:r>
+        <w:rPr>
+          <w:rFonts w:ascii="Calibri" w:hAnsi="Calibri" w:cs="Calibri"/>
+        </w:rPr>
+        <w:t xml:space="preserve">    </w:t>
+      </w:r>
+      <w:proofErr w:type="spellStart"/>
+      <w:r>
+        <w:rPr>
+          <w:rFonts w:ascii="Calibri" w:hAnsi="Calibri" w:cs="Calibri"/>
+        </w:rPr>
+        <w:t>wind_consumption</w:t>
+      </w:r>
+      <w:proofErr w:type="spellEnd"/>
+      <w:r>
+        <w:rPr>
+          <w:rFonts w:ascii="Calibri" w:hAnsi="Calibri" w:cs="Calibri"/>
+        </w:rPr>
+        <w:t xml:space="preserve"> integer</w:t>
+      </w:r>
+    </w:p>
+    <w:p>
+      <w:pPr>
+        <w:pStyle w:val="NoSpacing"/>
+        <w:rPr>
+          <w:rFonts w:ascii="Calibri" w:hAnsi="Calibri" w:cs="Calibri"/>
+        </w:rPr>
+      </w:pPr>
+      <w:r>
+        <w:rPr>
+          <w:rFonts w:ascii="Calibri" w:hAnsi="Calibri" w:cs="Calibri"/>
+        </w:rPr>
+        <w:t>)</w:t>
+      </w:r>
+    </w:p>
+    <w:p>
+      <w:pPr>
+        <w:pStyle w:val="NoSpacing"/>
+        <w:rPr>
+          <w:rFonts w:ascii="Calibri" w:hAnsi="Calibri" w:cs="Calibri"/>
+        </w:rPr>
+      </w:pPr>
+    </w:p>
+    <w:p>
+      <w:pPr>
+        <w:pStyle w:val="NoSpacing"/>
+        <w:rPr>
+          <w:rFonts w:ascii="Calibri" w:hAnsi="Calibri" w:cs="Calibri"/>
+        </w:rPr>
+      </w:pPr>
+      <w:r>
+        <w:rPr>
+          <w:rFonts w:ascii="Calibri" w:hAnsi="Calibri" w:cs="Calibri"/>
+        </w:rPr>
+        <w:t xml:space="preserve">TABLESPACE </w:t>
+      </w:r>
+      <w:proofErr w:type="spellStart"/>
+      <w:r>
+        <w:rPr>
+          <w:rFonts w:ascii="Calibri" w:hAnsi="Calibri" w:cs="Calibri"/>
+        </w:rPr>
+        <w:t>pg_default</w:t>
+      </w:r>
+      <w:proofErr w:type="spellEnd"/>
+      <w:r>
+        <w:rPr>
+          <w:rFonts w:ascii="Calibri" w:hAnsi="Calibri" w:cs="Calibri"/>
+        </w:rPr>
+        <w:t>;</w:t>
+      </w:r>
+    </w:p>
+    <w:p>
+      <w:pPr>
+        <w:pStyle w:val="NoSpacing"/>
+        <w:rPr>
+          <w:rFonts w:ascii="Calibri" w:hAnsi="Calibri" w:cs="Calibri"/>
+        </w:rPr>
+      </w:pPr>
+    </w:p>
+    <w:p>
+      <w:pPr>
+        <w:pStyle w:val="NoSpacing"/>
+        <w:rPr>
+          <w:rFonts w:ascii="Calibri" w:hAnsi="Calibri" w:cs="Calibri"/>
+        </w:rPr>
+      </w:pPr>
+      <w:r>
+        <w:rPr>
+          <w:rFonts w:ascii="Calibri" w:hAnsi="Calibri" w:cs="Calibri"/>
+        </w:rPr>
+        <w:t xml:space="preserve">ALTER TABLE IF EXISTS </w:t>
+      </w:r>
+      <w:proofErr w:type="spellStart"/>
+      <w:r>
+        <w:rPr>
+          <w:rFonts w:ascii="Calibri" w:hAnsi="Calibri" w:cs="Calibri"/>
+        </w:rPr>
+        <w:t>public.staging_allcountryenergy</w:t>
+      </w:r>
+      <w:proofErr w:type="spellEnd"/>
+    </w:p>
+    <w:p>
+      <w:pPr>
+        <w:pStyle w:val="NoSpacing"/>
+        <w:rPr>
+          <w:rFonts w:ascii="Calibri" w:hAnsi="Calibri" w:cs="Calibri"/>
+        </w:rPr>
+      </w:pPr>
+      <w:r>
+        <w:rPr>
+          <w:rFonts w:ascii="Calibri" w:hAnsi="Calibri" w:cs="Calibri"/>
+        </w:rPr>
+        <w:t xml:space="preserve">    OWNER to </w:t>
+      </w:r>
+      <w:proofErr w:type="spellStart"/>
+      <w:r>
+        <w:rPr>
+          <w:rFonts w:ascii="Calibri" w:hAnsi="Calibri" w:cs="Calibri"/>
+        </w:rPr>
+        <w:t>postgres</w:t>
+      </w:r>
+      <w:proofErr w:type="spellEnd"/>
+      <w:r>
+        <w:rPr>
+          <w:rFonts w:ascii="Calibri" w:hAnsi="Calibri" w:cs="Calibri"/>
+        </w:rPr>
+        <w:t>;</w:t>
+      </w:r>
     </w:p>
     <w:sectPr>
       <w:pgSz w:w="12240" w:h="15840"/>
@@ -1217,6 +2803,15 @@
       <w:spacing w:val="5"/>
     </w:rPr>
   </w:style>
+  <w:style w:type="paragraph" w:styleId="NoSpacing">
+    <w:name w:val="No Spacing"/>
+    <w:uiPriority w:val="1"/>
+    <w:qFormat/>
+    <w:rsid w:val="005557AB"/>
+    <w:pPr>
+      <w:spacing w:after="0" w:line="240" w:lineRule="auto"/>
+    </w:pPr>
+  </w:style>
 </w:styles>
 </file>
 

</xml_diff>

<commit_message>
Updating World Energy and ETL to DB using python
</commit_message>
<xml_diff>
--- a/sql/SQL Scripts for Renewable Energy Project.docx
+++ b/sql/SQL Scripts for Renewable Energy Project.docx
@@ -242,12 +242,10 @@
         <w:t xml:space="preserve">-- Table: </w:t>
       </w:r>
       <w:proofErr w:type="spellStart"/>
-      <w:proofErr w:type="gramStart"/>
       <w:r>
         <w:t>public.isocodes</w:t>
       </w:r>
       <w:proofErr w:type="spellEnd"/>
-      <w:proofErr w:type="gramEnd"/>
     </w:p>
     <w:p>
       <w:pPr>
@@ -262,12 +260,10 @@
         <w:t xml:space="preserve">-- DROP TABLE IF EXISTS </w:t>
       </w:r>
       <w:proofErr w:type="spellStart"/>
-      <w:proofErr w:type="gramStart"/>
       <w:r>
         <w:t>public.isocodes</w:t>
       </w:r>
       <w:proofErr w:type="spellEnd"/>
-      <w:proofErr w:type="gramEnd"/>
       <w:r>
         <w:t>;</w:t>
       </w:r>
@@ -285,12 +281,10 @@
         <w:t xml:space="preserve">CREATE TABLE IF NOT EXISTS </w:t>
       </w:r>
       <w:proofErr w:type="spellStart"/>
-      <w:proofErr w:type="gramStart"/>
       <w:r>
         <w:t>public.isocodes</w:t>
       </w:r>
       <w:proofErr w:type="spellEnd"/>
-      <w:proofErr w:type="gramEnd"/>
     </w:p>
     <w:p>
       <w:pPr>
@@ -337,15 +331,7 @@
       </w:r>
       <w:proofErr w:type="spellEnd"/>
       <w:r>
-        <w:t xml:space="preserve"> character </w:t>
-      </w:r>
-      <w:proofErr w:type="gramStart"/>
-      <w:r>
-        <w:t>varying(</w:t>
-      </w:r>
-      <w:proofErr w:type="gramEnd"/>
-      <w:r>
-        <w:t xml:space="preserve">3) COLLATE </w:t>
+        <w:t xml:space="preserve"> character varying(3) COLLATE </w:t>
       </w:r>
       <w:proofErr w:type="spellStart"/>
       <w:r>
@@ -438,12 +424,10 @@
         <w:t xml:space="preserve">ALTER TABLE IF EXISTS </w:t>
       </w:r>
       <w:proofErr w:type="spellStart"/>
-      <w:proofErr w:type="gramStart"/>
       <w:r>
         <w:t>public.isocodes</w:t>
       </w:r>
       <w:proofErr w:type="spellEnd"/>
-      <w:proofErr w:type="gramEnd"/>
     </w:p>
     <w:p>
       <w:pPr>
@@ -491,7 +475,6 @@
         <w:t xml:space="preserve">-- Table: </w:t>
       </w:r>
       <w:proofErr w:type="spellStart"/>
-      <w:proofErr w:type="gramStart"/>
       <w:r>
         <w:rPr>
           <w:rFonts w:ascii="Calibri" w:hAnsi="Calibri" w:cs="Calibri"/>
@@ -499,7 +482,6 @@
         <w:t>public.allcountryenergy</w:t>
       </w:r>
       <w:proofErr w:type="spellEnd"/>
-      <w:proofErr w:type="gramEnd"/>
     </w:p>
     <w:p>
       <w:pPr>
@@ -523,7 +505,6 @@
         <w:t xml:space="preserve">-- DROP TABLE IF EXISTS </w:t>
       </w:r>
       <w:proofErr w:type="spellStart"/>
-      <w:proofErr w:type="gramStart"/>
       <w:r>
         <w:rPr>
           <w:rFonts w:ascii="Calibri" w:hAnsi="Calibri" w:cs="Calibri"/>
@@ -531,7 +512,6 @@
         <w:t>public.allcountryenergy</w:t>
       </w:r>
       <w:proofErr w:type="spellEnd"/>
-      <w:proofErr w:type="gramEnd"/>
       <w:r>
         <w:rPr>
           <w:rFonts w:ascii="Calibri" w:hAnsi="Calibri" w:cs="Calibri"/>
@@ -561,7 +541,6 @@
         <w:t xml:space="preserve">CREATE TABLE IF NOT EXISTS </w:t>
       </w:r>
       <w:proofErr w:type="spellStart"/>
-      <w:proofErr w:type="gramStart"/>
       <w:r>
         <w:rPr>
           <w:rFonts w:ascii="Calibri" w:hAnsi="Calibri" w:cs="Calibri"/>
@@ -569,7 +548,6 @@
         <w:t>public.allcountryenergy</w:t>
       </w:r>
       <w:proofErr w:type="spellEnd"/>
-      <w:proofErr w:type="gramEnd"/>
     </w:p>
     <w:p>
       <w:pPr>
@@ -638,21 +616,7 @@
         <w:rPr>
           <w:rFonts w:ascii="Calibri" w:hAnsi="Calibri" w:cs="Calibri"/>
         </w:rPr>
-        <w:t xml:space="preserve"> character </w:t>
-      </w:r>
-      <w:proofErr w:type="gramStart"/>
-      <w:r>
-        <w:rPr>
-          <w:rFonts w:ascii="Calibri" w:hAnsi="Calibri" w:cs="Calibri"/>
-        </w:rPr>
-        <w:t>varying(</w:t>
-      </w:r>
-      <w:proofErr w:type="gramEnd"/>
-      <w:r>
-        <w:rPr>
-          <w:rFonts w:ascii="Calibri" w:hAnsi="Calibri" w:cs="Calibri"/>
-        </w:rPr>
-        <w:t xml:space="preserve">5) COLLATE </w:t>
+        <w:t xml:space="preserve"> character varying(5) COLLATE </w:t>
       </w:r>
       <w:proofErr w:type="spellStart"/>
       <w:r>
@@ -662,14 +626,12 @@
         <w:t>pg_catalog."default</w:t>
       </w:r>
       <w:proofErr w:type="spellEnd"/>
-      <w:proofErr w:type="gramStart"/>
       <w:r>
         <w:rPr>
           <w:rFonts w:ascii="Calibri" w:hAnsi="Calibri" w:cs="Calibri"/>
         </w:rPr>
         <w:t>" ,</w:t>
       </w:r>
-      <w:proofErr w:type="gramEnd"/>
     </w:p>
     <w:p>
       <w:pPr>
@@ -1878,7 +1840,6 @@
         <w:t xml:space="preserve">ALTER TABLE IF EXISTS </w:t>
       </w:r>
       <w:proofErr w:type="spellStart"/>
-      <w:proofErr w:type="gramStart"/>
       <w:r>
         <w:rPr>
           <w:rFonts w:ascii="Calibri" w:hAnsi="Calibri" w:cs="Calibri"/>
@@ -1886,7 +1847,1816 @@
         <w:t>public.allcountryenergy</w:t>
       </w:r>
       <w:proofErr w:type="spellEnd"/>
-      <w:proofErr w:type="gramEnd"/>
+    </w:p>
+    <w:p>
+      <w:pPr>
+        <w:pStyle w:val="NoSpacing"/>
+        <w:rPr>
+          <w:rFonts w:ascii="Calibri" w:hAnsi="Calibri" w:cs="Calibri"/>
+        </w:rPr>
+      </w:pPr>
+      <w:r>
+        <w:rPr>
+          <w:rFonts w:ascii="Calibri" w:hAnsi="Calibri" w:cs="Calibri"/>
+        </w:rPr>
+        <w:t xml:space="preserve">    OWNER to </w:t>
+      </w:r>
+      <w:proofErr w:type="spellStart"/>
+      <w:r>
+        <w:rPr>
+          <w:rFonts w:ascii="Calibri" w:hAnsi="Calibri" w:cs="Calibri"/>
+        </w:rPr>
+        <w:t>postgres</w:t>
+      </w:r>
+      <w:proofErr w:type="spellEnd"/>
+      <w:r>
+        <w:rPr>
+          <w:rFonts w:ascii="Calibri" w:hAnsi="Calibri" w:cs="Calibri"/>
+        </w:rPr>
+        <w:t>;</w:t>
+      </w:r>
+    </w:p>
+    <w:p>
+      <w:pPr>
+        <w:pStyle w:val="NoSpacing"/>
+        <w:rPr>
+          <w:rFonts w:ascii="Calibri" w:hAnsi="Calibri" w:cs="Calibri"/>
+        </w:rPr>
+      </w:pPr>
+    </w:p>
+    <w:p>
+      <w:pPr>
+        <w:pStyle w:val="NoSpacing"/>
+        <w:rPr>
+          <w:rFonts w:ascii="Calibri" w:hAnsi="Calibri" w:cs="Calibri"/>
+        </w:rPr>
+      </w:pPr>
+      <w:r>
+        <w:rPr>
+          <w:rFonts w:ascii="Calibri" w:hAnsi="Calibri" w:cs="Calibri"/>
+        </w:rPr>
+        <w:t xml:space="preserve">-- Table: </w:t>
+      </w:r>
+      <w:proofErr w:type="spellStart"/>
+      <w:r>
+        <w:rPr>
+          <w:rFonts w:ascii="Calibri" w:hAnsi="Calibri" w:cs="Calibri"/>
+        </w:rPr>
+        <w:t>public.worldconsumption</w:t>
+      </w:r>
+      <w:proofErr w:type="spellEnd"/>
+    </w:p>
+    <w:p>
+      <w:pPr>
+        <w:pStyle w:val="NoSpacing"/>
+        <w:rPr>
+          <w:rFonts w:ascii="Calibri" w:hAnsi="Calibri" w:cs="Calibri"/>
+        </w:rPr>
+      </w:pPr>
+    </w:p>
+    <w:p>
+      <w:pPr>
+        <w:pStyle w:val="NoSpacing"/>
+        <w:rPr>
+          <w:rFonts w:ascii="Calibri" w:hAnsi="Calibri" w:cs="Calibri"/>
+        </w:rPr>
+      </w:pPr>
+      <w:r>
+        <w:rPr>
+          <w:rFonts w:ascii="Calibri" w:hAnsi="Calibri" w:cs="Calibri"/>
+        </w:rPr>
+        <w:t xml:space="preserve">-- DROP TABLE IF EXISTS </w:t>
+      </w:r>
+      <w:proofErr w:type="spellStart"/>
+      <w:r>
+        <w:rPr>
+          <w:rFonts w:ascii="Calibri" w:hAnsi="Calibri" w:cs="Calibri"/>
+        </w:rPr>
+        <w:t>public.worldconsumption</w:t>
+      </w:r>
+      <w:proofErr w:type="spellEnd"/>
+      <w:r>
+        <w:rPr>
+          <w:rFonts w:ascii="Calibri" w:hAnsi="Calibri" w:cs="Calibri"/>
+        </w:rPr>
+        <w:t>;</w:t>
+      </w:r>
+    </w:p>
+    <w:p>
+      <w:pPr>
+        <w:pStyle w:val="NoSpacing"/>
+        <w:rPr>
+          <w:rFonts w:ascii="Calibri" w:hAnsi="Calibri" w:cs="Calibri"/>
+        </w:rPr>
+      </w:pPr>
+    </w:p>
+    <w:p>
+      <w:pPr>
+        <w:pStyle w:val="NoSpacing"/>
+        <w:rPr>
+          <w:rFonts w:ascii="Calibri" w:hAnsi="Calibri" w:cs="Calibri"/>
+        </w:rPr>
+      </w:pPr>
+      <w:r>
+        <w:rPr>
+          <w:rFonts w:ascii="Calibri" w:hAnsi="Calibri" w:cs="Calibri"/>
+        </w:rPr>
+        <w:t xml:space="preserve">CREATE TABLE IF NOT EXISTS </w:t>
+      </w:r>
+      <w:proofErr w:type="spellStart"/>
+      <w:r>
+        <w:rPr>
+          <w:rFonts w:ascii="Calibri" w:hAnsi="Calibri" w:cs="Calibri"/>
+        </w:rPr>
+        <w:t>public.worldconsumption</w:t>
+      </w:r>
+      <w:proofErr w:type="spellEnd"/>
+    </w:p>
+    <w:p>
+      <w:pPr>
+        <w:pStyle w:val="NoSpacing"/>
+        <w:rPr>
+          <w:rFonts w:ascii="Calibri" w:hAnsi="Calibri" w:cs="Calibri"/>
+        </w:rPr>
+      </w:pPr>
+      <w:r>
+        <w:rPr>
+          <w:rFonts w:ascii="Calibri" w:hAnsi="Calibri" w:cs="Calibri"/>
+        </w:rPr>
+        <w:t>(</w:t>
+      </w:r>
+    </w:p>
+    <w:p>
+      <w:pPr>
+        <w:pStyle w:val="NoSpacing"/>
+        <w:rPr>
+          <w:rFonts w:ascii="Calibri" w:hAnsi="Calibri" w:cs="Calibri"/>
+        </w:rPr>
+      </w:pPr>
+      <w:r>
+        <w:rPr>
+          <w:rFonts w:ascii="Calibri" w:hAnsi="Calibri" w:cs="Calibri"/>
+        </w:rPr>
+        <w:t xml:space="preserve">    "Continent" text COLLATE </w:t>
+      </w:r>
+      <w:proofErr w:type="spellStart"/>
+      <w:r>
+        <w:rPr>
+          <w:rFonts w:ascii="Calibri" w:hAnsi="Calibri" w:cs="Calibri"/>
+        </w:rPr>
+        <w:t>pg_catalog."default</w:t>
+      </w:r>
+      <w:proofErr w:type="spellEnd"/>
+      <w:r>
+        <w:rPr>
+          <w:rFonts w:ascii="Calibri" w:hAnsi="Calibri" w:cs="Calibri"/>
+        </w:rPr>
+        <w:t>",</w:t>
+      </w:r>
+    </w:p>
+    <w:p>
+      <w:pPr>
+        <w:pStyle w:val="NoSpacing"/>
+        <w:rPr>
+          <w:rFonts w:ascii="Calibri" w:hAnsi="Calibri" w:cs="Calibri"/>
+        </w:rPr>
+      </w:pPr>
+      <w:r>
+        <w:rPr>
+          <w:rFonts w:ascii="Calibri" w:hAnsi="Calibri" w:cs="Calibri"/>
+        </w:rPr>
+        <w:t xml:space="preserve">    "Country" text COLLATE </w:t>
+      </w:r>
+      <w:proofErr w:type="spellStart"/>
+      <w:r>
+        <w:rPr>
+          <w:rFonts w:ascii="Calibri" w:hAnsi="Calibri" w:cs="Calibri"/>
+        </w:rPr>
+        <w:t>pg_catalog."default</w:t>
+      </w:r>
+      <w:proofErr w:type="spellEnd"/>
+      <w:r>
+        <w:rPr>
+          <w:rFonts w:ascii="Calibri" w:hAnsi="Calibri" w:cs="Calibri"/>
+        </w:rPr>
+        <w:t>",</w:t>
+      </w:r>
+    </w:p>
+    <w:p>
+      <w:pPr>
+        <w:pStyle w:val="NoSpacing"/>
+        <w:rPr>
+          <w:rFonts w:ascii="Calibri" w:hAnsi="Calibri" w:cs="Calibri"/>
+        </w:rPr>
+      </w:pPr>
+      <w:r>
+        <w:rPr>
+          <w:rFonts w:ascii="Calibri" w:hAnsi="Calibri" w:cs="Calibri"/>
+        </w:rPr>
+        <w:t xml:space="preserve">    "Energy" text COLLATE </w:t>
+      </w:r>
+      <w:proofErr w:type="spellStart"/>
+      <w:r>
+        <w:rPr>
+          <w:rFonts w:ascii="Calibri" w:hAnsi="Calibri" w:cs="Calibri"/>
+        </w:rPr>
+        <w:t>pg_catalog."default</w:t>
+      </w:r>
+      <w:proofErr w:type="spellEnd"/>
+      <w:r>
+        <w:rPr>
+          <w:rFonts w:ascii="Calibri" w:hAnsi="Calibri" w:cs="Calibri"/>
+        </w:rPr>
+        <w:t>",</w:t>
+      </w:r>
+    </w:p>
+    <w:p>
+      <w:pPr>
+        <w:pStyle w:val="NoSpacing"/>
+        <w:rPr>
+          <w:rFonts w:ascii="Calibri" w:hAnsi="Calibri" w:cs="Calibri"/>
+        </w:rPr>
+      </w:pPr>
+      <w:r>
+        <w:rPr>
+          <w:rFonts w:ascii="Calibri" w:hAnsi="Calibri" w:cs="Calibri"/>
+        </w:rPr>
+        <w:t xml:space="preserve">    "1980" numeric(20,10),</w:t>
+      </w:r>
+    </w:p>
+    <w:p>
+      <w:pPr>
+        <w:pStyle w:val="NoSpacing"/>
+        <w:rPr>
+          <w:rFonts w:ascii="Calibri" w:hAnsi="Calibri" w:cs="Calibri"/>
+        </w:rPr>
+      </w:pPr>
+      <w:r>
+        <w:rPr>
+          <w:rFonts w:ascii="Calibri" w:hAnsi="Calibri" w:cs="Calibri"/>
+        </w:rPr>
+        <w:t xml:space="preserve">    "1981" numeric(20,10),</w:t>
+      </w:r>
+    </w:p>
+    <w:p>
+      <w:pPr>
+        <w:pStyle w:val="NoSpacing"/>
+        <w:rPr>
+          <w:rFonts w:ascii="Calibri" w:hAnsi="Calibri" w:cs="Calibri"/>
+        </w:rPr>
+      </w:pPr>
+      <w:r>
+        <w:rPr>
+          <w:rFonts w:ascii="Calibri" w:hAnsi="Calibri" w:cs="Calibri"/>
+        </w:rPr>
+        <w:t xml:space="preserve">    "1982" numeric(20,10),</w:t>
+      </w:r>
+    </w:p>
+    <w:p>
+      <w:pPr>
+        <w:pStyle w:val="NoSpacing"/>
+        <w:rPr>
+          <w:rFonts w:ascii="Calibri" w:hAnsi="Calibri" w:cs="Calibri"/>
+        </w:rPr>
+      </w:pPr>
+      <w:r>
+        <w:rPr>
+          <w:rFonts w:ascii="Calibri" w:hAnsi="Calibri" w:cs="Calibri"/>
+        </w:rPr>
+        <w:t xml:space="preserve">    "1983" numeric(20,10),</w:t>
+      </w:r>
+    </w:p>
+    <w:p>
+      <w:pPr>
+        <w:pStyle w:val="NoSpacing"/>
+        <w:rPr>
+          <w:rFonts w:ascii="Calibri" w:hAnsi="Calibri" w:cs="Calibri"/>
+        </w:rPr>
+      </w:pPr>
+      <w:r>
+        <w:rPr>
+          <w:rFonts w:ascii="Calibri" w:hAnsi="Calibri" w:cs="Calibri"/>
+        </w:rPr>
+        <w:t xml:space="preserve">    "1984" numeric(20,10),</w:t>
+      </w:r>
+    </w:p>
+    <w:p>
+      <w:pPr>
+        <w:pStyle w:val="NoSpacing"/>
+        <w:rPr>
+          <w:rFonts w:ascii="Calibri" w:hAnsi="Calibri" w:cs="Calibri"/>
+        </w:rPr>
+      </w:pPr>
+      <w:r>
+        <w:rPr>
+          <w:rFonts w:ascii="Calibri" w:hAnsi="Calibri" w:cs="Calibri"/>
+        </w:rPr>
+        <w:t xml:space="preserve">    "1985" numeric(20,10),</w:t>
+      </w:r>
+    </w:p>
+    <w:p>
+      <w:pPr>
+        <w:pStyle w:val="NoSpacing"/>
+        <w:rPr>
+          <w:rFonts w:ascii="Calibri" w:hAnsi="Calibri" w:cs="Calibri"/>
+        </w:rPr>
+      </w:pPr>
+      <w:r>
+        <w:rPr>
+          <w:rFonts w:ascii="Calibri" w:hAnsi="Calibri" w:cs="Calibri"/>
+        </w:rPr>
+        <w:t xml:space="preserve">    "1986" numeric(20,10),</w:t>
+      </w:r>
+    </w:p>
+    <w:p>
+      <w:pPr>
+        <w:pStyle w:val="NoSpacing"/>
+        <w:rPr>
+          <w:rFonts w:ascii="Calibri" w:hAnsi="Calibri" w:cs="Calibri"/>
+        </w:rPr>
+      </w:pPr>
+      <w:r>
+        <w:rPr>
+          <w:rFonts w:ascii="Calibri" w:hAnsi="Calibri" w:cs="Calibri"/>
+        </w:rPr>
+        <w:t xml:space="preserve">    "1987" numeric(20,10),</w:t>
+      </w:r>
+    </w:p>
+    <w:p>
+      <w:pPr>
+        <w:pStyle w:val="NoSpacing"/>
+        <w:rPr>
+          <w:rFonts w:ascii="Calibri" w:hAnsi="Calibri" w:cs="Calibri"/>
+        </w:rPr>
+      </w:pPr>
+      <w:r>
+        <w:rPr>
+          <w:rFonts w:ascii="Calibri" w:hAnsi="Calibri" w:cs="Calibri"/>
+        </w:rPr>
+        <w:t xml:space="preserve">    "1988" numeric(20,10),</w:t>
+      </w:r>
+    </w:p>
+    <w:p>
+      <w:pPr>
+        <w:pStyle w:val="NoSpacing"/>
+        <w:rPr>
+          <w:rFonts w:ascii="Calibri" w:hAnsi="Calibri" w:cs="Calibri"/>
+        </w:rPr>
+      </w:pPr>
+      <w:r>
+        <w:rPr>
+          <w:rFonts w:ascii="Calibri" w:hAnsi="Calibri" w:cs="Calibri"/>
+        </w:rPr>
+        <w:t xml:space="preserve">    "1989" numeric(20,10),</w:t>
+      </w:r>
+    </w:p>
+    <w:p>
+      <w:pPr>
+        <w:pStyle w:val="NoSpacing"/>
+        <w:rPr>
+          <w:rFonts w:ascii="Calibri" w:hAnsi="Calibri" w:cs="Calibri"/>
+        </w:rPr>
+      </w:pPr>
+      <w:r>
+        <w:rPr>
+          <w:rFonts w:ascii="Calibri" w:hAnsi="Calibri" w:cs="Calibri"/>
+        </w:rPr>
+        <w:t xml:space="preserve">    "1990" numeric(20,10),</w:t>
+      </w:r>
+    </w:p>
+    <w:p>
+      <w:pPr>
+        <w:pStyle w:val="NoSpacing"/>
+        <w:rPr>
+          <w:rFonts w:ascii="Calibri" w:hAnsi="Calibri" w:cs="Calibri"/>
+        </w:rPr>
+      </w:pPr>
+      <w:r>
+        <w:rPr>
+          <w:rFonts w:ascii="Calibri" w:hAnsi="Calibri" w:cs="Calibri"/>
+        </w:rPr>
+        <w:t xml:space="preserve">    "1991" numeric(20,10),</w:t>
+      </w:r>
+    </w:p>
+    <w:p>
+      <w:pPr>
+        <w:pStyle w:val="NoSpacing"/>
+        <w:rPr>
+          <w:rFonts w:ascii="Calibri" w:hAnsi="Calibri" w:cs="Calibri"/>
+        </w:rPr>
+      </w:pPr>
+      <w:r>
+        <w:rPr>
+          <w:rFonts w:ascii="Calibri" w:hAnsi="Calibri" w:cs="Calibri"/>
+        </w:rPr>
+        <w:t xml:space="preserve">    "1992" numeric(20,10),</w:t>
+      </w:r>
+    </w:p>
+    <w:p>
+      <w:pPr>
+        <w:pStyle w:val="NoSpacing"/>
+        <w:rPr>
+          <w:rFonts w:ascii="Calibri" w:hAnsi="Calibri" w:cs="Calibri"/>
+        </w:rPr>
+      </w:pPr>
+      <w:r>
+        <w:rPr>
+          <w:rFonts w:ascii="Calibri" w:hAnsi="Calibri" w:cs="Calibri"/>
+        </w:rPr>
+        <w:t xml:space="preserve">    "1993" numeric(20,10),</w:t>
+      </w:r>
+    </w:p>
+    <w:p>
+      <w:pPr>
+        <w:pStyle w:val="NoSpacing"/>
+        <w:rPr>
+          <w:rFonts w:ascii="Calibri" w:hAnsi="Calibri" w:cs="Calibri"/>
+        </w:rPr>
+      </w:pPr>
+      <w:r>
+        <w:rPr>
+          <w:rFonts w:ascii="Calibri" w:hAnsi="Calibri" w:cs="Calibri"/>
+        </w:rPr>
+        <w:t xml:space="preserve">    "1994" numeric(20,10),</w:t>
+      </w:r>
+    </w:p>
+    <w:p>
+      <w:pPr>
+        <w:pStyle w:val="NoSpacing"/>
+        <w:rPr>
+          <w:rFonts w:ascii="Calibri" w:hAnsi="Calibri" w:cs="Calibri"/>
+        </w:rPr>
+      </w:pPr>
+      <w:r>
+        <w:rPr>
+          <w:rFonts w:ascii="Calibri" w:hAnsi="Calibri" w:cs="Calibri"/>
+        </w:rPr>
+        <w:t xml:space="preserve">    "1995" numeric(20,10),</w:t>
+      </w:r>
+    </w:p>
+    <w:p>
+      <w:pPr>
+        <w:pStyle w:val="NoSpacing"/>
+        <w:rPr>
+          <w:rFonts w:ascii="Calibri" w:hAnsi="Calibri" w:cs="Calibri"/>
+        </w:rPr>
+      </w:pPr>
+      <w:r>
+        <w:rPr>
+          <w:rFonts w:ascii="Calibri" w:hAnsi="Calibri" w:cs="Calibri"/>
+        </w:rPr>
+        <w:t xml:space="preserve">    "1996" numeric(20,10),</w:t>
+      </w:r>
+    </w:p>
+    <w:p>
+      <w:pPr>
+        <w:pStyle w:val="NoSpacing"/>
+        <w:rPr>
+          <w:rFonts w:ascii="Calibri" w:hAnsi="Calibri" w:cs="Calibri"/>
+        </w:rPr>
+      </w:pPr>
+      <w:r>
+        <w:rPr>
+          <w:rFonts w:ascii="Calibri" w:hAnsi="Calibri" w:cs="Calibri"/>
+        </w:rPr>
+        <w:t xml:space="preserve">    "1997" numeric(20,10),</w:t>
+      </w:r>
+    </w:p>
+    <w:p>
+      <w:pPr>
+        <w:pStyle w:val="NoSpacing"/>
+        <w:rPr>
+          <w:rFonts w:ascii="Calibri" w:hAnsi="Calibri" w:cs="Calibri"/>
+        </w:rPr>
+      </w:pPr>
+      <w:r>
+        <w:rPr>
+          <w:rFonts w:ascii="Calibri" w:hAnsi="Calibri" w:cs="Calibri"/>
+        </w:rPr>
+        <w:t xml:space="preserve">    "1998" numeric(20,10),</w:t>
+      </w:r>
+    </w:p>
+    <w:p>
+      <w:pPr>
+        <w:pStyle w:val="NoSpacing"/>
+        <w:rPr>
+          <w:rFonts w:ascii="Calibri" w:hAnsi="Calibri" w:cs="Calibri"/>
+        </w:rPr>
+      </w:pPr>
+      <w:r>
+        <w:rPr>
+          <w:rFonts w:ascii="Calibri" w:hAnsi="Calibri" w:cs="Calibri"/>
+        </w:rPr>
+        <w:t xml:space="preserve">    "1999" numeric(20,10),</w:t>
+      </w:r>
+    </w:p>
+    <w:p>
+      <w:pPr>
+        <w:pStyle w:val="NoSpacing"/>
+        <w:rPr>
+          <w:rFonts w:ascii="Calibri" w:hAnsi="Calibri" w:cs="Calibri"/>
+        </w:rPr>
+      </w:pPr>
+      <w:r>
+        <w:rPr>
+          <w:rFonts w:ascii="Calibri" w:hAnsi="Calibri" w:cs="Calibri"/>
+        </w:rPr>
+        <w:t xml:space="preserve">    "2000" numeric(20,10),</w:t>
+      </w:r>
+    </w:p>
+    <w:p>
+      <w:pPr>
+        <w:pStyle w:val="NoSpacing"/>
+        <w:rPr>
+          <w:rFonts w:ascii="Calibri" w:hAnsi="Calibri" w:cs="Calibri"/>
+        </w:rPr>
+      </w:pPr>
+      <w:r>
+        <w:rPr>
+          <w:rFonts w:ascii="Calibri" w:hAnsi="Calibri" w:cs="Calibri"/>
+        </w:rPr>
+        <w:t xml:space="preserve">    "2001" numeric(20,10),</w:t>
+      </w:r>
+    </w:p>
+    <w:p>
+      <w:pPr>
+        <w:pStyle w:val="NoSpacing"/>
+        <w:rPr>
+          <w:rFonts w:ascii="Calibri" w:hAnsi="Calibri" w:cs="Calibri"/>
+        </w:rPr>
+      </w:pPr>
+      <w:r>
+        <w:rPr>
+          <w:rFonts w:ascii="Calibri" w:hAnsi="Calibri" w:cs="Calibri"/>
+        </w:rPr>
+        <w:t xml:space="preserve">    "2002" numeric(20,10),</w:t>
+      </w:r>
+    </w:p>
+    <w:p>
+      <w:pPr>
+        <w:pStyle w:val="NoSpacing"/>
+        <w:rPr>
+          <w:rFonts w:ascii="Calibri" w:hAnsi="Calibri" w:cs="Calibri"/>
+        </w:rPr>
+      </w:pPr>
+      <w:r>
+        <w:rPr>
+          <w:rFonts w:ascii="Calibri" w:hAnsi="Calibri" w:cs="Calibri"/>
+        </w:rPr>
+        <w:lastRenderedPageBreak/>
+        <w:t xml:space="preserve">    "2003" numeric(20,10),</w:t>
+      </w:r>
+    </w:p>
+    <w:p>
+      <w:pPr>
+        <w:pStyle w:val="NoSpacing"/>
+        <w:rPr>
+          <w:rFonts w:ascii="Calibri" w:hAnsi="Calibri" w:cs="Calibri"/>
+        </w:rPr>
+      </w:pPr>
+      <w:r>
+        <w:rPr>
+          <w:rFonts w:ascii="Calibri" w:hAnsi="Calibri" w:cs="Calibri"/>
+        </w:rPr>
+        <w:t xml:space="preserve">    "2004" numeric(20,10),</w:t>
+      </w:r>
+    </w:p>
+    <w:p>
+      <w:pPr>
+        <w:pStyle w:val="NoSpacing"/>
+        <w:rPr>
+          <w:rFonts w:ascii="Calibri" w:hAnsi="Calibri" w:cs="Calibri"/>
+        </w:rPr>
+      </w:pPr>
+      <w:r>
+        <w:rPr>
+          <w:rFonts w:ascii="Calibri" w:hAnsi="Calibri" w:cs="Calibri"/>
+        </w:rPr>
+        <w:t xml:space="preserve">    "2005" numeric(20,10),</w:t>
+      </w:r>
+    </w:p>
+    <w:p>
+      <w:pPr>
+        <w:pStyle w:val="NoSpacing"/>
+        <w:rPr>
+          <w:rFonts w:ascii="Calibri" w:hAnsi="Calibri" w:cs="Calibri"/>
+        </w:rPr>
+      </w:pPr>
+      <w:r>
+        <w:rPr>
+          <w:rFonts w:ascii="Calibri" w:hAnsi="Calibri" w:cs="Calibri"/>
+        </w:rPr>
+        <w:t xml:space="preserve">    "2006" numeric(20,10),</w:t>
+      </w:r>
+    </w:p>
+    <w:p>
+      <w:pPr>
+        <w:pStyle w:val="NoSpacing"/>
+        <w:rPr>
+          <w:rFonts w:ascii="Calibri" w:hAnsi="Calibri" w:cs="Calibri"/>
+        </w:rPr>
+      </w:pPr>
+      <w:r>
+        <w:rPr>
+          <w:rFonts w:ascii="Calibri" w:hAnsi="Calibri" w:cs="Calibri"/>
+        </w:rPr>
+        <w:t xml:space="preserve">    "2007" numeric(20,10),</w:t>
+      </w:r>
+    </w:p>
+    <w:p>
+      <w:pPr>
+        <w:pStyle w:val="NoSpacing"/>
+        <w:rPr>
+          <w:rFonts w:ascii="Calibri" w:hAnsi="Calibri" w:cs="Calibri"/>
+        </w:rPr>
+      </w:pPr>
+      <w:r>
+        <w:rPr>
+          <w:rFonts w:ascii="Calibri" w:hAnsi="Calibri" w:cs="Calibri"/>
+        </w:rPr>
+        <w:t xml:space="preserve">    "2008" numeric(20,10),</w:t>
+      </w:r>
+    </w:p>
+    <w:p>
+      <w:pPr>
+        <w:pStyle w:val="NoSpacing"/>
+        <w:rPr>
+          <w:rFonts w:ascii="Calibri" w:hAnsi="Calibri" w:cs="Calibri"/>
+        </w:rPr>
+      </w:pPr>
+      <w:r>
+        <w:rPr>
+          <w:rFonts w:ascii="Calibri" w:hAnsi="Calibri" w:cs="Calibri"/>
+        </w:rPr>
+        <w:t xml:space="preserve">    "2009" numeric(20,10),</w:t>
+      </w:r>
+    </w:p>
+    <w:p>
+      <w:pPr>
+        <w:pStyle w:val="NoSpacing"/>
+        <w:rPr>
+          <w:rFonts w:ascii="Calibri" w:hAnsi="Calibri" w:cs="Calibri"/>
+        </w:rPr>
+      </w:pPr>
+      <w:r>
+        <w:rPr>
+          <w:rFonts w:ascii="Calibri" w:hAnsi="Calibri" w:cs="Calibri"/>
+        </w:rPr>
+        <w:t xml:space="preserve">    "2010" numeric(20,10),</w:t>
+      </w:r>
+    </w:p>
+    <w:p>
+      <w:pPr>
+        <w:pStyle w:val="NoSpacing"/>
+        <w:rPr>
+          <w:rFonts w:ascii="Calibri" w:hAnsi="Calibri" w:cs="Calibri"/>
+        </w:rPr>
+      </w:pPr>
+      <w:r>
+        <w:rPr>
+          <w:rFonts w:ascii="Calibri" w:hAnsi="Calibri" w:cs="Calibri"/>
+        </w:rPr>
+        <w:t xml:space="preserve">    "2011" numeric(20,10),</w:t>
+      </w:r>
+    </w:p>
+    <w:p>
+      <w:pPr>
+        <w:pStyle w:val="NoSpacing"/>
+        <w:rPr>
+          <w:rFonts w:ascii="Calibri" w:hAnsi="Calibri" w:cs="Calibri"/>
+        </w:rPr>
+      </w:pPr>
+      <w:r>
+        <w:rPr>
+          <w:rFonts w:ascii="Calibri" w:hAnsi="Calibri" w:cs="Calibri"/>
+        </w:rPr>
+        <w:t xml:space="preserve">    "2012" numeric(20,10),</w:t>
+      </w:r>
+    </w:p>
+    <w:p>
+      <w:pPr>
+        <w:pStyle w:val="NoSpacing"/>
+        <w:rPr>
+          <w:rFonts w:ascii="Calibri" w:hAnsi="Calibri" w:cs="Calibri"/>
+        </w:rPr>
+      </w:pPr>
+      <w:r>
+        <w:rPr>
+          <w:rFonts w:ascii="Calibri" w:hAnsi="Calibri" w:cs="Calibri"/>
+        </w:rPr>
+        <w:t xml:space="preserve">    "2013" numeric(20,10),</w:t>
+      </w:r>
+    </w:p>
+    <w:p>
+      <w:pPr>
+        <w:pStyle w:val="NoSpacing"/>
+        <w:rPr>
+          <w:rFonts w:ascii="Calibri" w:hAnsi="Calibri" w:cs="Calibri"/>
+        </w:rPr>
+      </w:pPr>
+      <w:r>
+        <w:rPr>
+          <w:rFonts w:ascii="Calibri" w:hAnsi="Calibri" w:cs="Calibri"/>
+        </w:rPr>
+        <w:t xml:space="preserve">    "2014" numeric(20,10),</w:t>
+      </w:r>
+    </w:p>
+    <w:p>
+      <w:pPr>
+        <w:pStyle w:val="NoSpacing"/>
+        <w:rPr>
+          <w:rFonts w:ascii="Calibri" w:hAnsi="Calibri" w:cs="Calibri"/>
+        </w:rPr>
+      </w:pPr>
+      <w:r>
+        <w:rPr>
+          <w:rFonts w:ascii="Calibri" w:hAnsi="Calibri" w:cs="Calibri"/>
+        </w:rPr>
+        <w:t xml:space="preserve">    "2015" numeric(20,10),</w:t>
+      </w:r>
+    </w:p>
+    <w:p>
+      <w:pPr>
+        <w:pStyle w:val="NoSpacing"/>
+        <w:rPr>
+          <w:rFonts w:ascii="Calibri" w:hAnsi="Calibri" w:cs="Calibri"/>
+        </w:rPr>
+      </w:pPr>
+      <w:r>
+        <w:rPr>
+          <w:rFonts w:ascii="Calibri" w:hAnsi="Calibri" w:cs="Calibri"/>
+        </w:rPr>
+        <w:t xml:space="preserve">    "2016" numeric(20,10),</w:t>
+      </w:r>
+    </w:p>
+    <w:p>
+      <w:pPr>
+        <w:pStyle w:val="NoSpacing"/>
+        <w:rPr>
+          <w:rFonts w:ascii="Calibri" w:hAnsi="Calibri" w:cs="Calibri"/>
+        </w:rPr>
+      </w:pPr>
+      <w:r>
+        <w:rPr>
+          <w:rFonts w:ascii="Calibri" w:hAnsi="Calibri" w:cs="Calibri"/>
+        </w:rPr>
+        <w:t xml:space="preserve">    "2017" numeric(20,10),</w:t>
+      </w:r>
+    </w:p>
+    <w:p>
+      <w:pPr>
+        <w:pStyle w:val="NoSpacing"/>
+        <w:rPr>
+          <w:rFonts w:ascii="Calibri" w:hAnsi="Calibri" w:cs="Calibri"/>
+        </w:rPr>
+      </w:pPr>
+      <w:r>
+        <w:rPr>
+          <w:rFonts w:ascii="Calibri" w:hAnsi="Calibri" w:cs="Calibri"/>
+        </w:rPr>
+        <w:t xml:space="preserve">    "2018" numeric(20,10),</w:t>
+      </w:r>
+    </w:p>
+    <w:p>
+      <w:pPr>
+        <w:pStyle w:val="NoSpacing"/>
+        <w:rPr>
+          <w:rFonts w:ascii="Calibri" w:hAnsi="Calibri" w:cs="Calibri"/>
+        </w:rPr>
+      </w:pPr>
+      <w:r>
+        <w:rPr>
+          <w:rFonts w:ascii="Calibri" w:hAnsi="Calibri" w:cs="Calibri"/>
+        </w:rPr>
+        <w:t xml:space="preserve">    "2019" numeric(20,10),</w:t>
+      </w:r>
+    </w:p>
+    <w:p>
+      <w:pPr>
+        <w:pStyle w:val="NoSpacing"/>
+        <w:rPr>
+          <w:rFonts w:ascii="Calibri" w:hAnsi="Calibri" w:cs="Calibri"/>
+        </w:rPr>
+      </w:pPr>
+      <w:r>
+        <w:rPr>
+          <w:rFonts w:ascii="Calibri" w:hAnsi="Calibri" w:cs="Calibri"/>
+        </w:rPr>
+        <w:t xml:space="preserve">    "2020" numeric(20,10),</w:t>
+      </w:r>
+    </w:p>
+    <w:p>
+      <w:pPr>
+        <w:pStyle w:val="NoSpacing"/>
+        <w:rPr>
+          <w:rFonts w:ascii="Calibri" w:hAnsi="Calibri" w:cs="Calibri"/>
+        </w:rPr>
+      </w:pPr>
+      <w:r>
+        <w:rPr>
+          <w:rFonts w:ascii="Calibri" w:hAnsi="Calibri" w:cs="Calibri"/>
+        </w:rPr>
+        <w:t xml:space="preserve">    "2021" numeric(20,10),</w:t>
+      </w:r>
+    </w:p>
+    <w:p>
+      <w:pPr>
+        <w:pStyle w:val="NoSpacing"/>
+        <w:rPr>
+          <w:rFonts w:ascii="Calibri" w:hAnsi="Calibri" w:cs="Calibri"/>
+        </w:rPr>
+      </w:pPr>
+      <w:r>
+        <w:rPr>
+          <w:rFonts w:ascii="Calibri" w:hAnsi="Calibri" w:cs="Calibri"/>
+        </w:rPr>
+        <w:t xml:space="preserve">    "Consumption" numeric(20,10)</w:t>
+      </w:r>
+    </w:p>
+    <w:p>
+      <w:pPr>
+        <w:pStyle w:val="NoSpacing"/>
+        <w:rPr>
+          <w:rFonts w:ascii="Calibri" w:hAnsi="Calibri" w:cs="Calibri"/>
+        </w:rPr>
+      </w:pPr>
+      <w:r>
+        <w:rPr>
+          <w:rFonts w:ascii="Calibri" w:hAnsi="Calibri" w:cs="Calibri"/>
+        </w:rPr>
+        <w:t>)</w:t>
+      </w:r>
+    </w:p>
+    <w:p>
+      <w:pPr>
+        <w:pStyle w:val="NoSpacing"/>
+        <w:rPr>
+          <w:rFonts w:ascii="Calibri" w:hAnsi="Calibri" w:cs="Calibri"/>
+        </w:rPr>
+      </w:pPr>
+    </w:p>
+    <w:p>
+      <w:pPr>
+        <w:pStyle w:val="NoSpacing"/>
+        <w:rPr>
+          <w:rFonts w:ascii="Calibri" w:hAnsi="Calibri" w:cs="Calibri"/>
+        </w:rPr>
+      </w:pPr>
+      <w:r>
+        <w:rPr>
+          <w:rFonts w:ascii="Calibri" w:hAnsi="Calibri" w:cs="Calibri"/>
+        </w:rPr>
+        <w:t xml:space="preserve">TABLESPACE </w:t>
+      </w:r>
+      <w:proofErr w:type="spellStart"/>
+      <w:r>
+        <w:rPr>
+          <w:rFonts w:ascii="Calibri" w:hAnsi="Calibri" w:cs="Calibri"/>
+        </w:rPr>
+        <w:t>pg_default</w:t>
+      </w:r>
+      <w:proofErr w:type="spellEnd"/>
+      <w:r>
+        <w:rPr>
+          <w:rFonts w:ascii="Calibri" w:hAnsi="Calibri" w:cs="Calibri"/>
+        </w:rPr>
+        <w:t>;</w:t>
+      </w:r>
+    </w:p>
+    <w:p>
+      <w:pPr>
+        <w:pStyle w:val="NoSpacing"/>
+        <w:rPr>
+          <w:rFonts w:ascii="Calibri" w:hAnsi="Calibri" w:cs="Calibri"/>
+        </w:rPr>
+      </w:pPr>
+    </w:p>
+    <w:p>
+      <w:pPr>
+        <w:pStyle w:val="NoSpacing"/>
+        <w:rPr>
+          <w:rFonts w:ascii="Calibri" w:hAnsi="Calibri" w:cs="Calibri"/>
+        </w:rPr>
+      </w:pPr>
+      <w:r>
+        <w:rPr>
+          <w:rFonts w:ascii="Calibri" w:hAnsi="Calibri" w:cs="Calibri"/>
+        </w:rPr>
+        <w:t xml:space="preserve">ALTER TABLE IF EXISTS </w:t>
+      </w:r>
+      <w:proofErr w:type="spellStart"/>
+      <w:r>
+        <w:rPr>
+          <w:rFonts w:ascii="Calibri" w:hAnsi="Calibri" w:cs="Calibri"/>
+        </w:rPr>
+        <w:t>public.worldconsumption</w:t>
+      </w:r>
+      <w:proofErr w:type="spellEnd"/>
+    </w:p>
+    <w:p>
+      <w:pPr>
+        <w:pStyle w:val="NoSpacing"/>
+        <w:rPr>
+          <w:rFonts w:ascii="Calibri" w:hAnsi="Calibri" w:cs="Calibri"/>
+        </w:rPr>
+      </w:pPr>
+      <w:r>
+        <w:rPr>
+          <w:rFonts w:ascii="Calibri" w:hAnsi="Calibri" w:cs="Calibri"/>
+        </w:rPr>
+        <w:t xml:space="preserve">    OWNER to </w:t>
+      </w:r>
+      <w:proofErr w:type="spellStart"/>
+      <w:r>
+        <w:rPr>
+          <w:rFonts w:ascii="Calibri" w:hAnsi="Calibri" w:cs="Calibri"/>
+        </w:rPr>
+        <w:t>postgres</w:t>
+      </w:r>
+      <w:proofErr w:type="spellEnd"/>
+      <w:r>
+        <w:rPr>
+          <w:rFonts w:ascii="Calibri" w:hAnsi="Calibri" w:cs="Calibri"/>
+        </w:rPr>
+        <w:t>;</w:t>
+      </w:r>
+    </w:p>
+    <w:p>
+      <w:pPr>
+        <w:pStyle w:val="NoSpacing"/>
+        <w:rPr>
+          <w:rFonts w:ascii="Calibri" w:hAnsi="Calibri" w:cs="Calibri"/>
+        </w:rPr>
+      </w:pPr>
+    </w:p>
+    <w:p>
+      <w:pPr>
+        <w:pStyle w:val="NoSpacing"/>
+        <w:rPr>
+          <w:rFonts w:ascii="Calibri" w:hAnsi="Calibri" w:cs="Calibri"/>
+        </w:rPr>
+      </w:pPr>
+      <w:r>
+        <w:rPr>
+          <w:rFonts w:ascii="Calibri" w:hAnsi="Calibri" w:cs="Calibri"/>
+        </w:rPr>
+        <w:t xml:space="preserve">-- Table: </w:t>
+      </w:r>
+      <w:proofErr w:type="spellStart"/>
+      <w:r>
+        <w:rPr>
+          <w:rFonts w:ascii="Calibri" w:hAnsi="Calibri" w:cs="Calibri"/>
+        </w:rPr>
+        <w:t>public.worldproduction</w:t>
+      </w:r>
+      <w:proofErr w:type="spellEnd"/>
+    </w:p>
+    <w:p>
+      <w:pPr>
+        <w:pStyle w:val="NoSpacing"/>
+        <w:rPr>
+          <w:rFonts w:ascii="Calibri" w:hAnsi="Calibri" w:cs="Calibri"/>
+        </w:rPr>
+      </w:pPr>
+    </w:p>
+    <w:p>
+      <w:pPr>
+        <w:pStyle w:val="NoSpacing"/>
+        <w:rPr>
+          <w:rFonts w:ascii="Calibri" w:hAnsi="Calibri" w:cs="Calibri"/>
+        </w:rPr>
+      </w:pPr>
+      <w:r>
+        <w:rPr>
+          <w:rFonts w:ascii="Calibri" w:hAnsi="Calibri" w:cs="Calibri"/>
+        </w:rPr>
+        <w:t xml:space="preserve">-- DROP TABLE IF EXISTS </w:t>
+      </w:r>
+      <w:proofErr w:type="spellStart"/>
+      <w:r>
+        <w:rPr>
+          <w:rFonts w:ascii="Calibri" w:hAnsi="Calibri" w:cs="Calibri"/>
+        </w:rPr>
+        <w:t>public.worldproduction</w:t>
+      </w:r>
+      <w:proofErr w:type="spellEnd"/>
+      <w:r>
+        <w:rPr>
+          <w:rFonts w:ascii="Calibri" w:hAnsi="Calibri" w:cs="Calibri"/>
+        </w:rPr>
+        <w:t>;</w:t>
+      </w:r>
+    </w:p>
+    <w:p>
+      <w:pPr>
+        <w:pStyle w:val="NoSpacing"/>
+        <w:rPr>
+          <w:rFonts w:ascii="Calibri" w:hAnsi="Calibri" w:cs="Calibri"/>
+        </w:rPr>
+      </w:pPr>
+    </w:p>
+    <w:p>
+      <w:pPr>
+        <w:pStyle w:val="NoSpacing"/>
+        <w:rPr>
+          <w:rFonts w:ascii="Calibri" w:hAnsi="Calibri" w:cs="Calibri"/>
+        </w:rPr>
+      </w:pPr>
+      <w:r>
+        <w:rPr>
+          <w:rFonts w:ascii="Calibri" w:hAnsi="Calibri" w:cs="Calibri"/>
+        </w:rPr>
+        <w:t xml:space="preserve">CREATE TABLE IF NOT EXISTS </w:t>
+      </w:r>
+      <w:proofErr w:type="spellStart"/>
+      <w:r>
+        <w:rPr>
+          <w:rFonts w:ascii="Calibri" w:hAnsi="Calibri" w:cs="Calibri"/>
+        </w:rPr>
+        <w:t>public.worldproduction</w:t>
+      </w:r>
+      <w:proofErr w:type="spellEnd"/>
+    </w:p>
+    <w:p>
+      <w:pPr>
+        <w:pStyle w:val="NoSpacing"/>
+        <w:rPr>
+          <w:rFonts w:ascii="Calibri" w:hAnsi="Calibri" w:cs="Calibri"/>
+        </w:rPr>
+      </w:pPr>
+      <w:r>
+        <w:rPr>
+          <w:rFonts w:ascii="Calibri" w:hAnsi="Calibri" w:cs="Calibri"/>
+        </w:rPr>
+        <w:t>(</w:t>
+      </w:r>
+    </w:p>
+    <w:p>
+      <w:pPr>
+        <w:pStyle w:val="NoSpacing"/>
+        <w:rPr>
+          <w:rFonts w:ascii="Calibri" w:hAnsi="Calibri" w:cs="Calibri"/>
+        </w:rPr>
+      </w:pPr>
+      <w:r>
+        <w:rPr>
+          <w:rFonts w:ascii="Calibri" w:hAnsi="Calibri" w:cs="Calibri"/>
+        </w:rPr>
+        <w:t xml:space="preserve">    "Continent" text COLLATE </w:t>
+      </w:r>
+      <w:proofErr w:type="spellStart"/>
+      <w:r>
+        <w:rPr>
+          <w:rFonts w:ascii="Calibri" w:hAnsi="Calibri" w:cs="Calibri"/>
+        </w:rPr>
+        <w:t>pg_catalog."default</w:t>
+      </w:r>
+      <w:proofErr w:type="spellEnd"/>
+      <w:r>
+        <w:rPr>
+          <w:rFonts w:ascii="Calibri" w:hAnsi="Calibri" w:cs="Calibri"/>
+        </w:rPr>
+        <w:t>",</w:t>
+      </w:r>
+    </w:p>
+    <w:p>
+      <w:pPr>
+        <w:pStyle w:val="NoSpacing"/>
+        <w:rPr>
+          <w:rFonts w:ascii="Calibri" w:hAnsi="Calibri" w:cs="Calibri"/>
+        </w:rPr>
+      </w:pPr>
+      <w:r>
+        <w:rPr>
+          <w:rFonts w:ascii="Calibri" w:hAnsi="Calibri" w:cs="Calibri"/>
+        </w:rPr>
+        <w:t xml:space="preserve">    "Country" text COLLATE </w:t>
+      </w:r>
+      <w:proofErr w:type="spellStart"/>
+      <w:r>
+        <w:rPr>
+          <w:rFonts w:ascii="Calibri" w:hAnsi="Calibri" w:cs="Calibri"/>
+        </w:rPr>
+        <w:t>pg_catalog."default</w:t>
+      </w:r>
+      <w:proofErr w:type="spellEnd"/>
+      <w:r>
+        <w:rPr>
+          <w:rFonts w:ascii="Calibri" w:hAnsi="Calibri" w:cs="Calibri"/>
+        </w:rPr>
+        <w:t>",</w:t>
+      </w:r>
+    </w:p>
+    <w:p>
+      <w:pPr>
+        <w:pStyle w:val="NoSpacing"/>
+        <w:rPr>
+          <w:rFonts w:ascii="Calibri" w:hAnsi="Calibri" w:cs="Calibri"/>
+        </w:rPr>
+      </w:pPr>
+      <w:r>
+        <w:rPr>
+          <w:rFonts w:ascii="Calibri" w:hAnsi="Calibri" w:cs="Calibri"/>
+        </w:rPr>
+        <w:t xml:space="preserve">    "Energy" text COLLATE </w:t>
+      </w:r>
+      <w:proofErr w:type="spellStart"/>
+      <w:r>
+        <w:rPr>
+          <w:rFonts w:ascii="Calibri" w:hAnsi="Calibri" w:cs="Calibri"/>
+        </w:rPr>
+        <w:t>pg_catalog."default</w:t>
+      </w:r>
+      <w:proofErr w:type="spellEnd"/>
+      <w:r>
+        <w:rPr>
+          <w:rFonts w:ascii="Calibri" w:hAnsi="Calibri" w:cs="Calibri"/>
+        </w:rPr>
+        <w:t>",</w:t>
+      </w:r>
+    </w:p>
+    <w:p>
+      <w:pPr>
+        <w:pStyle w:val="NoSpacing"/>
+        <w:rPr>
+          <w:rFonts w:ascii="Calibri" w:hAnsi="Calibri" w:cs="Calibri"/>
+        </w:rPr>
+      </w:pPr>
+      <w:r>
+        <w:rPr>
+          <w:rFonts w:ascii="Calibri" w:hAnsi="Calibri" w:cs="Calibri"/>
+        </w:rPr>
+        <w:t xml:space="preserve">    "1980" numeric(20,10),</w:t>
+      </w:r>
+    </w:p>
+    <w:p>
+      <w:pPr>
+        <w:pStyle w:val="NoSpacing"/>
+        <w:rPr>
+          <w:rFonts w:ascii="Calibri" w:hAnsi="Calibri" w:cs="Calibri"/>
+        </w:rPr>
+      </w:pPr>
+      <w:r>
+        <w:rPr>
+          <w:rFonts w:ascii="Calibri" w:hAnsi="Calibri" w:cs="Calibri"/>
+        </w:rPr>
+        <w:t xml:space="preserve">    "1981" numeric(20,10),</w:t>
+      </w:r>
+    </w:p>
+    <w:p>
+      <w:pPr>
+        <w:pStyle w:val="NoSpacing"/>
+        <w:rPr>
+          <w:rFonts w:ascii="Calibri" w:hAnsi="Calibri" w:cs="Calibri"/>
+        </w:rPr>
+      </w:pPr>
+      <w:r>
+        <w:rPr>
+          <w:rFonts w:ascii="Calibri" w:hAnsi="Calibri" w:cs="Calibri"/>
+        </w:rPr>
+        <w:t xml:space="preserve">    "1982" numeric(20,10),</w:t>
+      </w:r>
+    </w:p>
+    <w:p>
+      <w:pPr>
+        <w:pStyle w:val="NoSpacing"/>
+        <w:rPr>
+          <w:rFonts w:ascii="Calibri" w:hAnsi="Calibri" w:cs="Calibri"/>
+        </w:rPr>
+      </w:pPr>
+      <w:r>
+        <w:rPr>
+          <w:rFonts w:ascii="Calibri" w:hAnsi="Calibri" w:cs="Calibri"/>
+        </w:rPr>
+        <w:t xml:space="preserve">    "1983" numeric(20,10),</w:t>
+      </w:r>
+    </w:p>
+    <w:p>
+      <w:pPr>
+        <w:pStyle w:val="NoSpacing"/>
+        <w:rPr>
+          <w:rFonts w:ascii="Calibri" w:hAnsi="Calibri" w:cs="Calibri"/>
+        </w:rPr>
+      </w:pPr>
+      <w:r>
+        <w:rPr>
+          <w:rFonts w:ascii="Calibri" w:hAnsi="Calibri" w:cs="Calibri"/>
+        </w:rPr>
+        <w:t xml:space="preserve">    "1984" numeric(20,10),</w:t>
+      </w:r>
+    </w:p>
+    <w:p>
+      <w:pPr>
+        <w:pStyle w:val="NoSpacing"/>
+        <w:rPr>
+          <w:rFonts w:ascii="Calibri" w:hAnsi="Calibri" w:cs="Calibri"/>
+        </w:rPr>
+      </w:pPr>
+      <w:r>
+        <w:rPr>
+          <w:rFonts w:ascii="Calibri" w:hAnsi="Calibri" w:cs="Calibri"/>
+        </w:rPr>
+        <w:t xml:space="preserve">    "1985" numeric(20,10),</w:t>
+      </w:r>
+    </w:p>
+    <w:p>
+      <w:pPr>
+        <w:pStyle w:val="NoSpacing"/>
+        <w:rPr>
+          <w:rFonts w:ascii="Calibri" w:hAnsi="Calibri" w:cs="Calibri"/>
+        </w:rPr>
+      </w:pPr>
+      <w:r>
+        <w:rPr>
+          <w:rFonts w:ascii="Calibri" w:hAnsi="Calibri" w:cs="Calibri"/>
+        </w:rPr>
+        <w:t xml:space="preserve">    "1986" numeric(20,10),</w:t>
+      </w:r>
+    </w:p>
+    <w:p>
+      <w:pPr>
+        <w:pStyle w:val="NoSpacing"/>
+        <w:rPr>
+          <w:rFonts w:ascii="Calibri" w:hAnsi="Calibri" w:cs="Calibri"/>
+        </w:rPr>
+      </w:pPr>
+      <w:r>
+        <w:rPr>
+          <w:rFonts w:ascii="Calibri" w:hAnsi="Calibri" w:cs="Calibri"/>
+        </w:rPr>
+        <w:t xml:space="preserve">    "1987" numeric(20,10),</w:t>
+      </w:r>
+    </w:p>
+    <w:p>
+      <w:pPr>
+        <w:pStyle w:val="NoSpacing"/>
+        <w:rPr>
+          <w:rFonts w:ascii="Calibri" w:hAnsi="Calibri" w:cs="Calibri"/>
+        </w:rPr>
+      </w:pPr>
+      <w:r>
+        <w:rPr>
+          <w:rFonts w:ascii="Calibri" w:hAnsi="Calibri" w:cs="Calibri"/>
+        </w:rPr>
+        <w:lastRenderedPageBreak/>
+        <w:t xml:space="preserve">    "1988" numeric(20,10),</w:t>
+      </w:r>
+    </w:p>
+    <w:p>
+      <w:pPr>
+        <w:pStyle w:val="NoSpacing"/>
+        <w:rPr>
+          <w:rFonts w:ascii="Calibri" w:hAnsi="Calibri" w:cs="Calibri"/>
+        </w:rPr>
+      </w:pPr>
+      <w:r>
+        <w:rPr>
+          <w:rFonts w:ascii="Calibri" w:hAnsi="Calibri" w:cs="Calibri"/>
+        </w:rPr>
+        <w:t xml:space="preserve">    "1989" numeric(20,10),</w:t>
+      </w:r>
+    </w:p>
+    <w:p>
+      <w:pPr>
+        <w:pStyle w:val="NoSpacing"/>
+        <w:rPr>
+          <w:rFonts w:ascii="Calibri" w:hAnsi="Calibri" w:cs="Calibri"/>
+        </w:rPr>
+      </w:pPr>
+      <w:r>
+        <w:rPr>
+          <w:rFonts w:ascii="Calibri" w:hAnsi="Calibri" w:cs="Calibri"/>
+        </w:rPr>
+        <w:t xml:space="preserve">    "1990" numeric(20,10),</w:t>
+      </w:r>
+    </w:p>
+    <w:p>
+      <w:pPr>
+        <w:pStyle w:val="NoSpacing"/>
+        <w:rPr>
+          <w:rFonts w:ascii="Calibri" w:hAnsi="Calibri" w:cs="Calibri"/>
+        </w:rPr>
+      </w:pPr>
+      <w:r>
+        <w:rPr>
+          <w:rFonts w:ascii="Calibri" w:hAnsi="Calibri" w:cs="Calibri"/>
+        </w:rPr>
+        <w:t xml:space="preserve">    "1991" numeric(20,10),</w:t>
+      </w:r>
+    </w:p>
+    <w:p>
+      <w:pPr>
+        <w:pStyle w:val="NoSpacing"/>
+        <w:rPr>
+          <w:rFonts w:ascii="Calibri" w:hAnsi="Calibri" w:cs="Calibri"/>
+        </w:rPr>
+      </w:pPr>
+      <w:r>
+        <w:rPr>
+          <w:rFonts w:ascii="Calibri" w:hAnsi="Calibri" w:cs="Calibri"/>
+        </w:rPr>
+        <w:t xml:space="preserve">    "1992" numeric(20,10),</w:t>
+      </w:r>
+    </w:p>
+    <w:p>
+      <w:pPr>
+        <w:pStyle w:val="NoSpacing"/>
+        <w:rPr>
+          <w:rFonts w:ascii="Calibri" w:hAnsi="Calibri" w:cs="Calibri"/>
+        </w:rPr>
+      </w:pPr>
+      <w:r>
+        <w:rPr>
+          <w:rFonts w:ascii="Calibri" w:hAnsi="Calibri" w:cs="Calibri"/>
+        </w:rPr>
+        <w:t xml:space="preserve">    "1993" numeric(20,10),</w:t>
+      </w:r>
+    </w:p>
+    <w:p>
+      <w:pPr>
+        <w:pStyle w:val="NoSpacing"/>
+        <w:rPr>
+          <w:rFonts w:ascii="Calibri" w:hAnsi="Calibri" w:cs="Calibri"/>
+        </w:rPr>
+      </w:pPr>
+      <w:r>
+        <w:rPr>
+          <w:rFonts w:ascii="Calibri" w:hAnsi="Calibri" w:cs="Calibri"/>
+        </w:rPr>
+        <w:t xml:space="preserve">    "1994" numeric(20,10),</w:t>
+      </w:r>
+    </w:p>
+    <w:p>
+      <w:pPr>
+        <w:pStyle w:val="NoSpacing"/>
+        <w:rPr>
+          <w:rFonts w:ascii="Calibri" w:hAnsi="Calibri" w:cs="Calibri"/>
+        </w:rPr>
+      </w:pPr>
+      <w:r>
+        <w:rPr>
+          <w:rFonts w:ascii="Calibri" w:hAnsi="Calibri" w:cs="Calibri"/>
+        </w:rPr>
+        <w:t xml:space="preserve">    "1995" numeric(20,10),</w:t>
+      </w:r>
+    </w:p>
+    <w:p>
+      <w:pPr>
+        <w:pStyle w:val="NoSpacing"/>
+        <w:rPr>
+          <w:rFonts w:ascii="Calibri" w:hAnsi="Calibri" w:cs="Calibri"/>
+        </w:rPr>
+      </w:pPr>
+      <w:r>
+        <w:rPr>
+          <w:rFonts w:ascii="Calibri" w:hAnsi="Calibri" w:cs="Calibri"/>
+        </w:rPr>
+        <w:t xml:space="preserve">    "1996" numeric(20,10),</w:t>
+      </w:r>
+    </w:p>
+    <w:p>
+      <w:pPr>
+        <w:pStyle w:val="NoSpacing"/>
+        <w:rPr>
+          <w:rFonts w:ascii="Calibri" w:hAnsi="Calibri" w:cs="Calibri"/>
+        </w:rPr>
+      </w:pPr>
+      <w:r>
+        <w:rPr>
+          <w:rFonts w:ascii="Calibri" w:hAnsi="Calibri" w:cs="Calibri"/>
+        </w:rPr>
+        <w:t xml:space="preserve">    "1997" numeric(20,10),</w:t>
+      </w:r>
+    </w:p>
+    <w:p>
+      <w:pPr>
+        <w:pStyle w:val="NoSpacing"/>
+        <w:rPr>
+          <w:rFonts w:ascii="Calibri" w:hAnsi="Calibri" w:cs="Calibri"/>
+        </w:rPr>
+      </w:pPr>
+      <w:r>
+        <w:rPr>
+          <w:rFonts w:ascii="Calibri" w:hAnsi="Calibri" w:cs="Calibri"/>
+        </w:rPr>
+        <w:t xml:space="preserve">    "1998" numeric(20,10),</w:t>
+      </w:r>
+    </w:p>
+    <w:p>
+      <w:pPr>
+        <w:pStyle w:val="NoSpacing"/>
+        <w:rPr>
+          <w:rFonts w:ascii="Calibri" w:hAnsi="Calibri" w:cs="Calibri"/>
+        </w:rPr>
+      </w:pPr>
+      <w:r>
+        <w:rPr>
+          <w:rFonts w:ascii="Calibri" w:hAnsi="Calibri" w:cs="Calibri"/>
+        </w:rPr>
+        <w:t xml:space="preserve">    "1999" numeric(20,10),</w:t>
+      </w:r>
+    </w:p>
+    <w:p>
+      <w:pPr>
+        <w:pStyle w:val="NoSpacing"/>
+        <w:rPr>
+          <w:rFonts w:ascii="Calibri" w:hAnsi="Calibri" w:cs="Calibri"/>
+        </w:rPr>
+      </w:pPr>
+      <w:r>
+        <w:rPr>
+          <w:rFonts w:ascii="Calibri" w:hAnsi="Calibri" w:cs="Calibri"/>
+        </w:rPr>
+        <w:t xml:space="preserve">    "2000" numeric(20,10),</w:t>
+      </w:r>
+    </w:p>
+    <w:p>
+      <w:pPr>
+        <w:pStyle w:val="NoSpacing"/>
+        <w:rPr>
+          <w:rFonts w:ascii="Calibri" w:hAnsi="Calibri" w:cs="Calibri"/>
+        </w:rPr>
+      </w:pPr>
+      <w:r>
+        <w:rPr>
+          <w:rFonts w:ascii="Calibri" w:hAnsi="Calibri" w:cs="Calibri"/>
+        </w:rPr>
+        <w:t xml:space="preserve">    "2001" numeric(20,10),</w:t>
+      </w:r>
+    </w:p>
+    <w:p>
+      <w:pPr>
+        <w:pStyle w:val="NoSpacing"/>
+        <w:rPr>
+          <w:rFonts w:ascii="Calibri" w:hAnsi="Calibri" w:cs="Calibri"/>
+        </w:rPr>
+      </w:pPr>
+      <w:r>
+        <w:rPr>
+          <w:rFonts w:ascii="Calibri" w:hAnsi="Calibri" w:cs="Calibri"/>
+        </w:rPr>
+        <w:t xml:space="preserve">    "2002" numeric(20,10),</w:t>
+      </w:r>
+    </w:p>
+    <w:p>
+      <w:pPr>
+        <w:pStyle w:val="NoSpacing"/>
+        <w:rPr>
+          <w:rFonts w:ascii="Calibri" w:hAnsi="Calibri" w:cs="Calibri"/>
+        </w:rPr>
+      </w:pPr>
+      <w:r>
+        <w:rPr>
+          <w:rFonts w:ascii="Calibri" w:hAnsi="Calibri" w:cs="Calibri"/>
+        </w:rPr>
+        <w:t xml:space="preserve">    "2003" numeric(20,10),</w:t>
+      </w:r>
+    </w:p>
+    <w:p>
+      <w:pPr>
+        <w:pStyle w:val="NoSpacing"/>
+        <w:rPr>
+          <w:rFonts w:ascii="Calibri" w:hAnsi="Calibri" w:cs="Calibri"/>
+        </w:rPr>
+      </w:pPr>
+      <w:r>
+        <w:rPr>
+          <w:rFonts w:ascii="Calibri" w:hAnsi="Calibri" w:cs="Calibri"/>
+        </w:rPr>
+        <w:t xml:space="preserve">    "2004" numeric(20,10),</w:t>
+      </w:r>
+    </w:p>
+    <w:p>
+      <w:pPr>
+        <w:pStyle w:val="NoSpacing"/>
+        <w:rPr>
+          <w:rFonts w:ascii="Calibri" w:hAnsi="Calibri" w:cs="Calibri"/>
+        </w:rPr>
+      </w:pPr>
+      <w:r>
+        <w:rPr>
+          <w:rFonts w:ascii="Calibri" w:hAnsi="Calibri" w:cs="Calibri"/>
+        </w:rPr>
+        <w:t xml:space="preserve">    "2005" numeric(20,10),</w:t>
+      </w:r>
+    </w:p>
+    <w:p>
+      <w:pPr>
+        <w:pStyle w:val="NoSpacing"/>
+        <w:rPr>
+          <w:rFonts w:ascii="Calibri" w:hAnsi="Calibri" w:cs="Calibri"/>
+        </w:rPr>
+      </w:pPr>
+      <w:r>
+        <w:rPr>
+          <w:rFonts w:ascii="Calibri" w:hAnsi="Calibri" w:cs="Calibri"/>
+        </w:rPr>
+        <w:t xml:space="preserve">    "2006" numeric(20,10),</w:t>
+      </w:r>
+    </w:p>
+    <w:p>
+      <w:pPr>
+        <w:pStyle w:val="NoSpacing"/>
+        <w:rPr>
+          <w:rFonts w:ascii="Calibri" w:hAnsi="Calibri" w:cs="Calibri"/>
+        </w:rPr>
+      </w:pPr>
+      <w:r>
+        <w:rPr>
+          <w:rFonts w:ascii="Calibri" w:hAnsi="Calibri" w:cs="Calibri"/>
+        </w:rPr>
+        <w:t xml:space="preserve">    "2007" numeric(20,10),</w:t>
+      </w:r>
+    </w:p>
+    <w:p>
+      <w:pPr>
+        <w:pStyle w:val="NoSpacing"/>
+        <w:rPr>
+          <w:rFonts w:ascii="Calibri" w:hAnsi="Calibri" w:cs="Calibri"/>
+        </w:rPr>
+      </w:pPr>
+      <w:r>
+        <w:rPr>
+          <w:rFonts w:ascii="Calibri" w:hAnsi="Calibri" w:cs="Calibri"/>
+        </w:rPr>
+        <w:t xml:space="preserve">    "2008" numeric(20,10),</w:t>
+      </w:r>
+    </w:p>
+    <w:p>
+      <w:pPr>
+        <w:pStyle w:val="NoSpacing"/>
+        <w:rPr>
+          <w:rFonts w:ascii="Calibri" w:hAnsi="Calibri" w:cs="Calibri"/>
+        </w:rPr>
+      </w:pPr>
+      <w:r>
+        <w:rPr>
+          <w:rFonts w:ascii="Calibri" w:hAnsi="Calibri" w:cs="Calibri"/>
+        </w:rPr>
+        <w:t xml:space="preserve">    "2009" numeric(20,10),</w:t>
+      </w:r>
+    </w:p>
+    <w:p>
+      <w:pPr>
+        <w:pStyle w:val="NoSpacing"/>
+        <w:rPr>
+          <w:rFonts w:ascii="Calibri" w:hAnsi="Calibri" w:cs="Calibri"/>
+        </w:rPr>
+      </w:pPr>
+      <w:r>
+        <w:rPr>
+          <w:rFonts w:ascii="Calibri" w:hAnsi="Calibri" w:cs="Calibri"/>
+        </w:rPr>
+        <w:t xml:space="preserve">    "2010" numeric(20,10),</w:t>
+      </w:r>
+    </w:p>
+    <w:p>
+      <w:pPr>
+        <w:pStyle w:val="NoSpacing"/>
+        <w:rPr>
+          <w:rFonts w:ascii="Calibri" w:hAnsi="Calibri" w:cs="Calibri"/>
+        </w:rPr>
+      </w:pPr>
+      <w:r>
+        <w:rPr>
+          <w:rFonts w:ascii="Calibri" w:hAnsi="Calibri" w:cs="Calibri"/>
+        </w:rPr>
+        <w:t xml:space="preserve">    "2011" numeric(20,10),</w:t>
+      </w:r>
+    </w:p>
+    <w:p>
+      <w:pPr>
+        <w:pStyle w:val="NoSpacing"/>
+        <w:rPr>
+          <w:rFonts w:ascii="Calibri" w:hAnsi="Calibri" w:cs="Calibri"/>
+        </w:rPr>
+      </w:pPr>
+      <w:r>
+        <w:rPr>
+          <w:rFonts w:ascii="Calibri" w:hAnsi="Calibri" w:cs="Calibri"/>
+        </w:rPr>
+        <w:t xml:space="preserve">    "2012" numeric(20,10),</w:t>
+      </w:r>
+    </w:p>
+    <w:p>
+      <w:pPr>
+        <w:pStyle w:val="NoSpacing"/>
+        <w:rPr>
+          <w:rFonts w:ascii="Calibri" w:hAnsi="Calibri" w:cs="Calibri"/>
+        </w:rPr>
+      </w:pPr>
+      <w:r>
+        <w:rPr>
+          <w:rFonts w:ascii="Calibri" w:hAnsi="Calibri" w:cs="Calibri"/>
+        </w:rPr>
+        <w:t xml:space="preserve">    "2013" numeric(20,10),</w:t>
+      </w:r>
+    </w:p>
+    <w:p>
+      <w:pPr>
+        <w:pStyle w:val="NoSpacing"/>
+        <w:rPr>
+          <w:rFonts w:ascii="Calibri" w:hAnsi="Calibri" w:cs="Calibri"/>
+        </w:rPr>
+      </w:pPr>
+      <w:r>
+        <w:rPr>
+          <w:rFonts w:ascii="Calibri" w:hAnsi="Calibri" w:cs="Calibri"/>
+        </w:rPr>
+        <w:t xml:space="preserve">    "2014" numeric(20,10),</w:t>
+      </w:r>
+    </w:p>
+    <w:p>
+      <w:pPr>
+        <w:pStyle w:val="NoSpacing"/>
+        <w:rPr>
+          <w:rFonts w:ascii="Calibri" w:hAnsi="Calibri" w:cs="Calibri"/>
+        </w:rPr>
+      </w:pPr>
+      <w:r>
+        <w:rPr>
+          <w:rFonts w:ascii="Calibri" w:hAnsi="Calibri" w:cs="Calibri"/>
+        </w:rPr>
+        <w:t xml:space="preserve">    "2015" numeric(20,10),</w:t>
+      </w:r>
+    </w:p>
+    <w:p>
+      <w:pPr>
+        <w:pStyle w:val="NoSpacing"/>
+        <w:rPr>
+          <w:rFonts w:ascii="Calibri" w:hAnsi="Calibri" w:cs="Calibri"/>
+        </w:rPr>
+      </w:pPr>
+      <w:r>
+        <w:rPr>
+          <w:rFonts w:ascii="Calibri" w:hAnsi="Calibri" w:cs="Calibri"/>
+        </w:rPr>
+        <w:t xml:space="preserve">    "2016" numeric(20,10),</w:t>
+      </w:r>
+    </w:p>
+    <w:p>
+      <w:pPr>
+        <w:pStyle w:val="NoSpacing"/>
+        <w:rPr>
+          <w:rFonts w:ascii="Calibri" w:hAnsi="Calibri" w:cs="Calibri"/>
+        </w:rPr>
+      </w:pPr>
+      <w:r>
+        <w:rPr>
+          <w:rFonts w:ascii="Calibri" w:hAnsi="Calibri" w:cs="Calibri"/>
+        </w:rPr>
+        <w:t xml:space="preserve">    "2017" numeric(20,10),</w:t>
+      </w:r>
+    </w:p>
+    <w:p>
+      <w:pPr>
+        <w:pStyle w:val="NoSpacing"/>
+        <w:rPr>
+          <w:rFonts w:ascii="Calibri" w:hAnsi="Calibri" w:cs="Calibri"/>
+        </w:rPr>
+      </w:pPr>
+      <w:r>
+        <w:rPr>
+          <w:rFonts w:ascii="Calibri" w:hAnsi="Calibri" w:cs="Calibri"/>
+        </w:rPr>
+        <w:t xml:space="preserve">    "2018" numeric(20,10),</w:t>
+      </w:r>
+    </w:p>
+    <w:p>
+      <w:pPr>
+        <w:pStyle w:val="NoSpacing"/>
+        <w:rPr>
+          <w:rFonts w:ascii="Calibri" w:hAnsi="Calibri" w:cs="Calibri"/>
+        </w:rPr>
+      </w:pPr>
+      <w:r>
+        <w:rPr>
+          <w:rFonts w:ascii="Calibri" w:hAnsi="Calibri" w:cs="Calibri"/>
+        </w:rPr>
+        <w:t xml:space="preserve">    "2019" numeric(20,10),</w:t>
+      </w:r>
+    </w:p>
+    <w:p>
+      <w:pPr>
+        <w:pStyle w:val="NoSpacing"/>
+        <w:rPr>
+          <w:rFonts w:ascii="Calibri" w:hAnsi="Calibri" w:cs="Calibri"/>
+        </w:rPr>
+      </w:pPr>
+      <w:r>
+        <w:rPr>
+          <w:rFonts w:ascii="Calibri" w:hAnsi="Calibri" w:cs="Calibri"/>
+        </w:rPr>
+        <w:t xml:space="preserve">    "2020" numeric(20,10),</w:t>
+      </w:r>
+    </w:p>
+    <w:p>
+      <w:pPr>
+        <w:pStyle w:val="NoSpacing"/>
+        <w:rPr>
+          <w:rFonts w:ascii="Calibri" w:hAnsi="Calibri" w:cs="Calibri"/>
+        </w:rPr>
+      </w:pPr>
+      <w:r>
+        <w:rPr>
+          <w:rFonts w:ascii="Calibri" w:hAnsi="Calibri" w:cs="Calibri"/>
+        </w:rPr>
+        <w:t xml:space="preserve">    "2021" numeric(20,10),</w:t>
+      </w:r>
+    </w:p>
+    <w:p>
+      <w:pPr>
+        <w:pStyle w:val="NoSpacing"/>
+        <w:rPr>
+          <w:rFonts w:ascii="Calibri" w:hAnsi="Calibri" w:cs="Calibri"/>
+        </w:rPr>
+      </w:pPr>
+      <w:r>
+        <w:rPr>
+          <w:rFonts w:ascii="Calibri" w:hAnsi="Calibri" w:cs="Calibri"/>
+        </w:rPr>
+        <w:t xml:space="preserve">    "Production" numeric(20,10)</w:t>
+      </w:r>
+    </w:p>
+    <w:p>
+      <w:pPr>
+        <w:pStyle w:val="NoSpacing"/>
+        <w:rPr>
+          <w:rFonts w:ascii="Calibri" w:hAnsi="Calibri" w:cs="Calibri"/>
+        </w:rPr>
+      </w:pPr>
+      <w:r>
+        <w:rPr>
+          <w:rFonts w:ascii="Calibri" w:hAnsi="Calibri" w:cs="Calibri"/>
+        </w:rPr>
+        <w:t>)</w:t>
+      </w:r>
+    </w:p>
+    <w:p>
+      <w:pPr>
+        <w:pStyle w:val="NoSpacing"/>
+        <w:rPr>
+          <w:rFonts w:ascii="Calibri" w:hAnsi="Calibri" w:cs="Calibri"/>
+        </w:rPr>
+      </w:pPr>
+    </w:p>
+    <w:p>
+      <w:pPr>
+        <w:pStyle w:val="NoSpacing"/>
+        <w:rPr>
+          <w:rFonts w:ascii="Calibri" w:hAnsi="Calibri" w:cs="Calibri"/>
+        </w:rPr>
+      </w:pPr>
+      <w:r>
+        <w:rPr>
+          <w:rFonts w:ascii="Calibri" w:hAnsi="Calibri" w:cs="Calibri"/>
+        </w:rPr>
+        <w:t xml:space="preserve">TABLESPACE </w:t>
+      </w:r>
+      <w:proofErr w:type="spellStart"/>
+      <w:r>
+        <w:rPr>
+          <w:rFonts w:ascii="Calibri" w:hAnsi="Calibri" w:cs="Calibri"/>
+        </w:rPr>
+        <w:t>pg_default</w:t>
+      </w:r>
+      <w:proofErr w:type="spellEnd"/>
+      <w:r>
+        <w:rPr>
+          <w:rFonts w:ascii="Calibri" w:hAnsi="Calibri" w:cs="Calibri"/>
+        </w:rPr>
+        <w:t>;</w:t>
+      </w:r>
+    </w:p>
+    <w:p>
+      <w:pPr>
+        <w:pStyle w:val="NoSpacing"/>
+        <w:rPr>
+          <w:rFonts w:ascii="Calibri" w:hAnsi="Calibri" w:cs="Calibri"/>
+        </w:rPr>
+      </w:pPr>
+    </w:p>
+    <w:p>
+      <w:pPr>
+        <w:pStyle w:val="NoSpacing"/>
+        <w:rPr>
+          <w:rFonts w:ascii="Calibri" w:hAnsi="Calibri" w:cs="Calibri"/>
+        </w:rPr>
+      </w:pPr>
+      <w:r>
+        <w:rPr>
+          <w:rFonts w:ascii="Calibri" w:hAnsi="Calibri" w:cs="Calibri"/>
+        </w:rPr>
+        <w:t xml:space="preserve">ALTER TABLE IF EXISTS </w:t>
+      </w:r>
+      <w:proofErr w:type="spellStart"/>
+      <w:r>
+        <w:rPr>
+          <w:rFonts w:ascii="Calibri" w:hAnsi="Calibri" w:cs="Calibri"/>
+        </w:rPr>
+        <w:t>public.worldproduction</w:t>
+      </w:r>
+      <w:proofErr w:type="spellEnd"/>
     </w:p>
     <w:p>
       <w:pPr>

</xml_diff>